<commit_message>
fix: final consistency corrections to internship report - Missing values: 93 NaN + 25 blank TotalCharges + 2 invalid negatives = 120 total handled - Distinguish invalid values (set to NaN, imputed) vs IQR-capped values - IQR-capped: MonthlyCharges=2 (9999,4500), TenureMonths=1 (350), Total=3 - Invalid to NaN to imputed: 2 (MonthlyCharges=-150, TenureMonths=-12) - IQR bounds corrected to post-dedup post-imputation values: MC=[5.57,147.12], TN=[-33.50,106.50] - Object column count clarified: 15 total = 13 predictors + CustomerID + Churn - Removed all overly strong model-ready language - All 13 sections cross-checked; no contradictions remain
</commit_message>
<xml_diff>
--- a/Python_ML_Data_Preprocessing_Internship_Report.docx
+++ b/Python_ML_Data_Preprocessing_Internship_Report.docx
@@ -309,7 +309,7 @@
           <w:color w:val="1C1C2E"/>
           <w:sz w:val="20"/>
         </w:rPr>
-        <w:t>A synthetic customer churn dataset was generated using a dedicated Python module (src/generate_dataset.py) to simulate realistic Telco-style records. The dataset intentionally contains real-world data quality problems to demonstrate each preprocessing technique:</w:t>
+        <w:t>A synthetic customer churn dataset was generated using src/generate_dataset.py to simulate realistic Telco-style records. The dataset intentionally contains real-world data quality problems to demonstrate each preprocessing technique:</w:t>
       </w:r>
     </w:p>
     <w:p>
@@ -322,7 +322,7 @@
           <w:color w:val="1C1C2E"/>
           <w:sz w:val="20"/>
         </w:rPr>
-        <w:t>Missing values — NaN in Gender, SeniorCitizen, TenureMonths, PaymentMethod, MonthlyCharges</w:t>
+        <w:t>Missing values — 93 explicit NaN values across 5 columns (Gender=24, SeniorCitizen=15, TenureMonths=18, PaymentMethod=16, MonthlyCharges=20)</w:t>
       </w:r>
     </w:p>
     <w:p>
@@ -335,7 +335,33 @@
           <w:color w:val="1C1C2E"/>
           <w:sz w:val="20"/>
         </w:rPr>
-        <w:t>Blank strings — TotalCharges stored as whitespace strings for new customers</w:t>
+        <w:t>Blank strings — 25 TotalCharges cells stored as whitespace strings (simulating new customer records)</w:t>
+      </w:r>
+    </w:p>
+    <w:p>
+      <w:pPr>
+        <w:pStyle w:val="ListBullet"/>
+        <w:ind w:left="432"/>
+      </w:pPr>
+      <w:r>
+        <w:rPr>
+          <w:color w:val="1C1C2E"/>
+          <w:sz w:val="20"/>
+        </w:rPr>
+        <w:t>Invalid values — MonthlyCharges=−150.0 and TenureMonths=−12.0 (physically impossible; converted to NaN)</w:t>
+      </w:r>
+    </w:p>
+    <w:p>
+      <w:pPr>
+        <w:pStyle w:val="ListBullet"/>
+        <w:ind w:left="432"/>
+      </w:pPr>
+      <w:r>
+        <w:rPr>
+          <w:color w:val="1C1C2E"/>
+          <w:sz w:val="20"/>
+        </w:rPr>
+        <w:t>Total missing-like cells handled by imputation: 120 (93 NaN + 25 blank strings + 2 invalid negatives)</w:t>
       </w:r>
     </w:p>
     <w:p>
@@ -361,7 +387,7 @@
           <w:color w:val="1C1C2E"/>
           <w:sz w:val="20"/>
         </w:rPr>
-        <w:t>Outliers — extreme MonthlyCharges (9999.0, −150.0, 4500.0) and TenureMonths (350, −12)</w:t>
+        <w:t>Outliers — extreme MonthlyCharges (9,999.0 and 4,500.0) and TenureMonths (350 months)</w:t>
       </w:r>
     </w:p>
     <w:p>
@@ -374,7 +400,7 @@
           <w:color w:val="1C1C2E"/>
           <w:sz w:val="20"/>
         </w:rPr>
-        <w:t>Type mismatches — TotalCharges stored as object (string) dtype instead of float</w:t>
+        <w:t>Type mismatches — TotalCharges stored as object (string) dtype instead of float64</w:t>
       </w:r>
     </w:p>
     <w:p>
@@ -519,7 +545,7 @@
               <w:rPr>
                 <w:sz w:val="18"/>
               </w:rPr>
-              <w:t>Array operations, random seed control, numerical type conversion, vectorised clipping</w:t>
+              <w:t>Array operations, random seed control, numerical type conversion, vectorised np.clip()</w:t>
             </w:r>
           </w:p>
         </w:tc>
@@ -663,7 +689,7 @@
               <w:rPr>
                 <w:sz w:val="18"/>
               </w:rPr>
-              <w:t>FileNotFoundError, errors='coerce' for type-safe conversions</w:t>
+              <w:t>FileNotFoundError, errors='coerce' for type-safe numeric conversions</w:t>
             </w:r>
           </w:p>
         </w:tc>
@@ -764,16 +790,6 @@
       </w:r>
     </w:p>
     <w:p/>
-    <w:p>
-      <w:r>
-        <w:rPr>
-          <w:color w:val="1C1C2E"/>
-          <w:sz w:val="20"/>
-        </w:rPr>
-        <w:t>Raw dataset loaded: data/raw/customer_churn_raw.csv</w:t>
-      </w:r>
-    </w:p>
-    <w:p/>
     <w:tbl>
       <w:tblPr>
         <w:tblStyle w:val="TableGrid"/>
@@ -788,7 +804,7 @@
       <w:tr>
         <w:tc>
           <w:tcPr>
-            <w:tcW w:type="dxa" w:w="3600"/>
+            <w:tcW w:type="dxa" w:w="4320"/>
             <w:shd w:val="clear" w:color="auto" w:fill="1A355E"/>
           </w:tcPr>
           <w:p>
@@ -807,7 +823,7 @@
         </w:tc>
         <w:tc>
           <w:tcPr>
-            <w:tcW w:type="dxa" w:w="5760"/>
+            <w:tcW w:type="dxa" w:w="4896"/>
             <w:shd w:val="clear" w:color="auto" w:fill="1A355E"/>
           </w:tcPr>
           <w:p>
@@ -828,7 +844,7 @@
       <w:tr>
         <w:tc>
           <w:tcPr>
-            <w:tcW w:type="dxa" w:w="3600"/>
+            <w:tcW w:type="dxa" w:w="4320"/>
             <w:shd w:val="clear" w:color="auto" w:fill="EEF3FA"/>
           </w:tcPr>
           <w:p>
@@ -845,7 +861,7 @@
         </w:tc>
         <w:tc>
           <w:tcPr>
-            <w:tcW w:type="dxa" w:w="5760"/>
+            <w:tcW w:type="dxa" w:w="4896"/>
             <w:shd w:val="clear" w:color="auto" w:fill="EEF3FA"/>
           </w:tcPr>
           <w:p>
@@ -864,7 +880,7 @@
       <w:tr>
         <w:tc>
           <w:tcPr>
-            <w:tcW w:type="dxa" w:w="3600"/>
+            <w:tcW w:type="dxa" w:w="4320"/>
             <w:shd w:val="clear" w:color="auto" w:fill="FFFFFF"/>
           </w:tcPr>
           <w:p>
@@ -881,7 +897,7 @@
         </w:tc>
         <w:tc>
           <w:tcPr>
-            <w:tcW w:type="dxa" w:w="5760"/>
+            <w:tcW w:type="dxa" w:w="4896"/>
             <w:shd w:val="clear" w:color="auto" w:fill="FFFFFF"/>
           </w:tcPr>
           <w:p>
@@ -900,7 +916,7 @@
       <w:tr>
         <w:tc>
           <w:tcPr>
-            <w:tcW w:type="dxa" w:w="3600"/>
+            <w:tcW w:type="dxa" w:w="4320"/>
             <w:shd w:val="clear" w:color="auto" w:fill="EEF3FA"/>
           </w:tcPr>
           <w:p>
@@ -917,7 +933,7 @@
         </w:tc>
         <w:tc>
           <w:tcPr>
-            <w:tcW w:type="dxa" w:w="5760"/>
+            <w:tcW w:type="dxa" w:w="4896"/>
             <w:shd w:val="clear" w:color="auto" w:fill="EEF3FA"/>
           </w:tcPr>
           <w:p>
@@ -936,7 +952,7 @@
       <w:tr>
         <w:tc>
           <w:tcPr>
-            <w:tcW w:type="dxa" w:w="3600"/>
+            <w:tcW w:type="dxa" w:w="4320"/>
             <w:shd w:val="clear" w:color="auto" w:fill="FFFFFF"/>
           </w:tcPr>
           <w:p>
@@ -947,13 +963,13 @@
               <w:rPr>
                 <w:sz w:val="18"/>
               </w:rPr>
-              <w:t>Object Columns (total)</w:t>
+              <w:t>Object Columns — Total</w:t>
             </w:r>
           </w:p>
         </w:tc>
         <w:tc>
           <w:tcPr>
-            <w:tcW w:type="dxa" w:w="5760"/>
+            <w:tcW w:type="dxa" w:w="4896"/>
             <w:shd w:val="clear" w:color="auto" w:fill="FFFFFF"/>
           </w:tcPr>
           <w:p>
@@ -964,7 +980,7 @@
               <w:rPr>
                 <w:sz w:val="18"/>
               </w:rPr>
-              <w:t>15 (includes CustomerID and Churn)</w:t>
+              <w:t>15</w:t>
             </w:r>
           </w:p>
         </w:tc>
@@ -972,7 +988,7 @@
       <w:tr>
         <w:tc>
           <w:tcPr>
-            <w:tcW w:type="dxa" w:w="3600"/>
+            <w:tcW w:type="dxa" w:w="4320"/>
             <w:shd w:val="clear" w:color="auto" w:fill="EEF3FA"/>
           </w:tcPr>
           <w:p>
@@ -983,13 +999,13 @@
               <w:rPr>
                 <w:sz w:val="18"/>
               </w:rPr>
-              <w:t>Predictor Categorical Columns</w:t>
+              <w:t xml:space="preserve">  • Predictor categorical cols</w:t>
             </w:r>
           </w:p>
         </w:tc>
         <w:tc>
           <w:tcPr>
-            <w:tcW w:type="dxa" w:w="5760"/>
+            <w:tcW w:type="dxa" w:w="4896"/>
             <w:shd w:val="clear" w:color="auto" w:fill="EEF3FA"/>
           </w:tcPr>
           <w:p>
@@ -1000,7 +1016,7 @@
               <w:rPr>
                 <w:sz w:val="18"/>
               </w:rPr>
-              <w:t>13 object columns (excluding CustomerID and Churn)</w:t>
+              <w:t>13 (excluding CustomerID and Churn)</w:t>
             </w:r>
           </w:p>
         </w:tc>
@@ -1008,7 +1024,223 @@
       <w:tr>
         <w:tc>
           <w:tcPr>
-            <w:tcW w:type="dxa" w:w="3600"/>
+            <w:tcW w:type="dxa" w:w="4320"/>
+            <w:shd w:val="clear" w:color="auto" w:fill="FFFFFF"/>
+          </w:tcPr>
+          <w:p>
+            <w:pPr>
+              <w:jc w:val="center"/>
+            </w:pPr>
+            <w:r>
+              <w:rPr>
+                <w:sz w:val="18"/>
+              </w:rPr>
+              <w:t xml:space="preserve">  • CustomerID (primary key)</w:t>
+            </w:r>
+          </w:p>
+        </w:tc>
+        <w:tc>
+          <w:tcPr>
+            <w:tcW w:type="dxa" w:w="4896"/>
+            <w:shd w:val="clear" w:color="auto" w:fill="FFFFFF"/>
+          </w:tcPr>
+          <w:p>
+            <w:pPr>
+              <w:jc w:val="center"/>
+            </w:pPr>
+            <w:r>
+              <w:rPr>
+                <w:sz w:val="18"/>
+              </w:rPr>
+              <w:t>1 (dropped in feature selection)</w:t>
+            </w:r>
+          </w:p>
+        </w:tc>
+      </w:tr>
+      <w:tr>
+        <w:tc>
+          <w:tcPr>
+            <w:tcW w:type="dxa" w:w="4320"/>
+            <w:shd w:val="clear" w:color="auto" w:fill="EEF3FA"/>
+          </w:tcPr>
+          <w:p>
+            <w:pPr>
+              <w:jc w:val="center"/>
+            </w:pPr>
+            <w:r>
+              <w:rPr>
+                <w:sz w:val="18"/>
+              </w:rPr>
+              <w:t xml:space="preserve">  • Churn (target variable)</w:t>
+            </w:r>
+          </w:p>
+        </w:tc>
+        <w:tc>
+          <w:tcPr>
+            <w:tcW w:type="dxa" w:w="4896"/>
+            <w:shd w:val="clear" w:color="auto" w:fill="EEF3FA"/>
+          </w:tcPr>
+          <w:p>
+            <w:pPr>
+              <w:jc w:val="center"/>
+            </w:pPr>
+            <w:r>
+              <w:rPr>
+                <w:sz w:val="18"/>
+              </w:rPr>
+              <w:t>1 (encoded to 0/1 during encoding step)</w:t>
+            </w:r>
+          </w:p>
+        </w:tc>
+      </w:tr>
+      <w:tr>
+        <w:tc>
+          <w:tcPr>
+            <w:tcW w:type="dxa" w:w="4320"/>
+            <w:shd w:val="clear" w:color="auto" w:fill="FFFFFF"/>
+          </w:tcPr>
+          <w:p>
+            <w:pPr>
+              <w:jc w:val="center"/>
+            </w:pPr>
+            <w:r>
+              <w:rPr>
+                <w:sz w:val="18"/>
+              </w:rPr>
+              <w:t>Explicit NaN (raw CSV)</w:t>
+            </w:r>
+          </w:p>
+        </w:tc>
+        <w:tc>
+          <w:tcPr>
+            <w:tcW w:type="dxa" w:w="4896"/>
+            <w:shd w:val="clear" w:color="auto" w:fill="FFFFFF"/>
+          </w:tcPr>
+          <w:p>
+            <w:pPr>
+              <w:jc w:val="center"/>
+            </w:pPr>
+            <w:r>
+              <w:rPr>
+                <w:sz w:val="18"/>
+              </w:rPr>
+              <w:t>93</w:t>
+            </w:r>
+          </w:p>
+        </w:tc>
+      </w:tr>
+      <w:tr>
+        <w:tc>
+          <w:tcPr>
+            <w:tcW w:type="dxa" w:w="4320"/>
+            <w:shd w:val="clear" w:color="auto" w:fill="EEF3FA"/>
+          </w:tcPr>
+          <w:p>
+            <w:pPr>
+              <w:jc w:val="center"/>
+            </w:pPr>
+            <w:r>
+              <w:rPr>
+                <w:sz w:val="18"/>
+              </w:rPr>
+              <w:t>Blank TotalCharges strings</w:t>
+            </w:r>
+          </w:p>
+        </w:tc>
+        <w:tc>
+          <w:tcPr>
+            <w:tcW w:type="dxa" w:w="4896"/>
+            <w:shd w:val="clear" w:color="auto" w:fill="EEF3FA"/>
+          </w:tcPr>
+          <w:p>
+            <w:pPr>
+              <w:jc w:val="center"/>
+            </w:pPr>
+            <w:r>
+              <w:rPr>
+                <w:sz w:val="18"/>
+              </w:rPr>
+              <w:t>25</w:t>
+            </w:r>
+          </w:p>
+        </w:tc>
+      </w:tr>
+      <w:tr>
+        <w:tc>
+          <w:tcPr>
+            <w:tcW w:type="dxa" w:w="4320"/>
+            <w:shd w:val="clear" w:color="auto" w:fill="FFFFFF"/>
+          </w:tcPr>
+          <w:p>
+            <w:pPr>
+              <w:jc w:val="center"/>
+            </w:pPr>
+            <w:r>
+              <w:rPr>
+                <w:sz w:val="18"/>
+              </w:rPr>
+              <w:t>Invalid negative values → NaN</w:t>
+            </w:r>
+          </w:p>
+        </w:tc>
+        <w:tc>
+          <w:tcPr>
+            <w:tcW w:type="dxa" w:w="4896"/>
+            <w:shd w:val="clear" w:color="auto" w:fill="FFFFFF"/>
+          </w:tcPr>
+          <w:p>
+            <w:pPr>
+              <w:jc w:val="center"/>
+            </w:pPr>
+            <w:r>
+              <w:rPr>
+                <w:sz w:val="18"/>
+              </w:rPr>
+              <w:t>2</w:t>
+            </w:r>
+          </w:p>
+        </w:tc>
+      </w:tr>
+      <w:tr>
+        <w:tc>
+          <w:tcPr>
+            <w:tcW w:type="dxa" w:w="4320"/>
+            <w:shd w:val="clear" w:color="auto" w:fill="EEF3FA"/>
+          </w:tcPr>
+          <w:p>
+            <w:pPr>
+              <w:jc w:val="center"/>
+            </w:pPr>
+            <w:r>
+              <w:rPr>
+                <w:sz w:val="18"/>
+              </w:rPr>
+              <w:t>Total cells handled by imputation</w:t>
+            </w:r>
+          </w:p>
+        </w:tc>
+        <w:tc>
+          <w:tcPr>
+            <w:tcW w:type="dxa" w:w="4896"/>
+            <w:shd w:val="clear" w:color="auto" w:fill="EEF3FA"/>
+          </w:tcPr>
+          <w:p>
+            <w:pPr>
+              <w:jc w:val="center"/>
+            </w:pPr>
+            <w:r>
+              <w:rPr>
+                <w:sz w:val="18"/>
+              </w:rPr>
+              <w:t>120</w:t>
+            </w:r>
+          </w:p>
+        </w:tc>
+      </w:tr>
+      <w:tr>
+        <w:tc>
+          <w:tcPr>
+            <w:tcW w:type="dxa" w:w="4320"/>
             <w:shd w:val="clear" w:color="auto" w:fill="FFFFFF"/>
           </w:tcPr>
           <w:p>
@@ -1025,7 +1257,7 @@
         </w:tc>
         <w:tc>
           <w:tcPr>
-            <w:tcW w:type="dxa" w:w="5760"/>
+            <w:tcW w:type="dxa" w:w="4896"/>
             <w:shd w:val="clear" w:color="auto" w:fill="FFFFFF"/>
           </w:tcPr>
           <w:p>
@@ -1044,7 +1276,7 @@
       <w:tr>
         <w:tc>
           <w:tcPr>
-            <w:tcW w:type="dxa" w:w="3600"/>
+            <w:tcW w:type="dxa" w:w="4320"/>
             <w:shd w:val="clear" w:color="auto" w:fill="EEF3FA"/>
           </w:tcPr>
           <w:p>
@@ -1061,7 +1293,7 @@
         </w:tc>
         <w:tc>
           <w:tcPr>
-            <w:tcW w:type="dxa" w:w="5760"/>
+            <w:tcW w:type="dxa" w:w="4896"/>
             <w:shd w:val="clear" w:color="auto" w:fill="EEF3FA"/>
           </w:tcPr>
           <w:p>
@@ -1109,7 +1341,7 @@
           <w:color w:val="1C1C2E"/>
           <w:sz w:val="20"/>
         </w:rPr>
-        <w:t>The raw dataset contains 93 missing values across 5 columns. Note: TotalCharges is stored as an object dtype with blank strings (' ') which are treated as missing after type conversion.</w:t>
+        <w:t>The raw dataset contains a total of 120 missing or invalid cells that must be handled before modelling. These are categorised into three distinct types:</w:t>
       </w:r>
     </w:p>
     <w:p/>
@@ -1128,7 +1360,293 @@
       <w:tr>
         <w:tc>
           <w:tcPr>
-            <w:tcW w:type="dxa" w:w="2592"/>
+            <w:tcW w:type="dxa" w:w="3600"/>
+            <w:shd w:val="clear" w:color="auto" w:fill="1A355E"/>
+          </w:tcPr>
+          <w:p>
+            <w:pPr>
+              <w:jc w:val="center"/>
+            </w:pPr>
+            <w:r>
+              <w:rPr>
+                <w:b/>
+                <w:color w:val="FFFFFF"/>
+                <w:sz w:val="18"/>
+              </w:rPr>
+              <w:t>Category</w:t>
+            </w:r>
+          </w:p>
+        </w:tc>
+        <w:tc>
+          <w:tcPr>
+            <w:tcW w:type="dxa" w:w="1008"/>
+            <w:shd w:val="clear" w:color="auto" w:fill="1A355E"/>
+          </w:tcPr>
+          <w:p>
+            <w:pPr>
+              <w:jc w:val="center"/>
+            </w:pPr>
+            <w:r>
+              <w:rPr>
+                <w:b/>
+                <w:color w:val="FFFFFF"/>
+                <w:sz w:val="18"/>
+              </w:rPr>
+              <w:t>Count</w:t>
+            </w:r>
+          </w:p>
+        </w:tc>
+        <w:tc>
+          <w:tcPr>
+            <w:tcW w:type="dxa" w:w="5328"/>
+            <w:shd w:val="clear" w:color="auto" w:fill="1A355E"/>
+          </w:tcPr>
+          <w:p>
+            <w:pPr>
+              <w:jc w:val="center"/>
+            </w:pPr>
+            <w:r>
+              <w:rPr>
+                <w:b/>
+                <w:color w:val="FFFFFF"/>
+                <w:sz w:val="18"/>
+              </w:rPr>
+              <w:t>Description</w:t>
+            </w:r>
+          </w:p>
+        </w:tc>
+      </w:tr>
+      <w:tr>
+        <w:tc>
+          <w:tcPr>
+            <w:tcW w:type="dxa" w:w="3600"/>
+            <w:shd w:val="clear" w:color="auto" w:fill="EEF3FA"/>
+          </w:tcPr>
+          <w:p>
+            <w:pPr>
+              <w:jc w:val="center"/>
+            </w:pPr>
+            <w:r>
+              <w:rPr>
+                <w:sz w:val="18"/>
+              </w:rPr>
+              <w:t>A — Explicit NaN (CSV)</w:t>
+            </w:r>
+          </w:p>
+        </w:tc>
+        <w:tc>
+          <w:tcPr>
+            <w:tcW w:type="dxa" w:w="1008"/>
+            <w:shd w:val="clear" w:color="auto" w:fill="EEF3FA"/>
+          </w:tcPr>
+          <w:p>
+            <w:pPr>
+              <w:jc w:val="center"/>
+            </w:pPr>
+            <w:r>
+              <w:rPr>
+                <w:sz w:val="18"/>
+              </w:rPr>
+              <w:t>93</w:t>
+            </w:r>
+          </w:p>
+        </w:tc>
+        <w:tc>
+          <w:tcPr>
+            <w:tcW w:type="dxa" w:w="5328"/>
+            <w:shd w:val="clear" w:color="auto" w:fill="EEF3FA"/>
+          </w:tcPr>
+          <w:p>
+            <w:pPr>
+              <w:jc w:val="center"/>
+            </w:pPr>
+            <w:r>
+              <w:rPr>
+                <w:sz w:val="18"/>
+              </w:rPr>
+              <w:t>Values read as NaN directly from the CSV file across 5 columns</w:t>
+            </w:r>
+          </w:p>
+        </w:tc>
+      </w:tr>
+      <w:tr>
+        <w:tc>
+          <w:tcPr>
+            <w:tcW w:type="dxa" w:w="3600"/>
+            <w:shd w:val="clear" w:color="auto" w:fill="FFFFFF"/>
+          </w:tcPr>
+          <w:p>
+            <w:pPr>
+              <w:jc w:val="center"/>
+            </w:pPr>
+            <w:r>
+              <w:rPr>
+                <w:sz w:val="18"/>
+              </w:rPr>
+              <w:t>B — Blank string TotalCharges</w:t>
+            </w:r>
+          </w:p>
+        </w:tc>
+        <w:tc>
+          <w:tcPr>
+            <w:tcW w:type="dxa" w:w="1008"/>
+            <w:shd w:val="clear" w:color="auto" w:fill="FFFFFF"/>
+          </w:tcPr>
+          <w:p>
+            <w:pPr>
+              <w:jc w:val="center"/>
+            </w:pPr>
+            <w:r>
+              <w:rPr>
+                <w:sz w:val="18"/>
+              </w:rPr>
+              <w:t>25</w:t>
+            </w:r>
+          </w:p>
+        </w:tc>
+        <w:tc>
+          <w:tcPr>
+            <w:tcW w:type="dxa" w:w="5328"/>
+            <w:shd w:val="clear" w:color="auto" w:fill="FFFFFF"/>
+          </w:tcPr>
+          <w:p>
+            <w:pPr>
+              <w:jc w:val="center"/>
+            </w:pPr>
+            <w:r>
+              <w:rPr>
+                <w:sz w:val="18"/>
+              </w:rPr>
+              <w:t>TotalCharges cells containing only whitespace (' '); coerced to NaN by pd.to_numeric()</w:t>
+            </w:r>
+          </w:p>
+        </w:tc>
+      </w:tr>
+      <w:tr>
+        <w:tc>
+          <w:tcPr>
+            <w:tcW w:type="dxa" w:w="3600"/>
+            <w:shd w:val="clear" w:color="auto" w:fill="EEF3FA"/>
+          </w:tcPr>
+          <w:p>
+            <w:pPr>
+              <w:jc w:val="center"/>
+            </w:pPr>
+            <w:r>
+              <w:rPr>
+                <w:sz w:val="18"/>
+              </w:rPr>
+              <w:t>C — Invalid negatives → NaN</w:t>
+            </w:r>
+          </w:p>
+        </w:tc>
+        <w:tc>
+          <w:tcPr>
+            <w:tcW w:type="dxa" w:w="1008"/>
+            <w:shd w:val="clear" w:color="auto" w:fill="EEF3FA"/>
+          </w:tcPr>
+          <w:p>
+            <w:pPr>
+              <w:jc w:val="center"/>
+            </w:pPr>
+            <w:r>
+              <w:rPr>
+                <w:sz w:val="18"/>
+              </w:rPr>
+              <w:t>2</w:t>
+            </w:r>
+          </w:p>
+        </w:tc>
+        <w:tc>
+          <w:tcPr>
+            <w:tcW w:type="dxa" w:w="5328"/>
+            <w:shd w:val="clear" w:color="auto" w:fill="EEF3FA"/>
+          </w:tcPr>
+          <w:p>
+            <w:pPr>
+              <w:jc w:val="center"/>
+            </w:pPr>
+            <w:r>
+              <w:rPr>
+                <w:sz w:val="18"/>
+              </w:rPr>
+              <w:t>MonthlyCharges=−150.0 and TenureMonths=−12.0 set to NaN (physically impossible values)</w:t>
+            </w:r>
+          </w:p>
+        </w:tc>
+      </w:tr>
+      <w:tr>
+        <w:tc>
+          <w:tcPr>
+            <w:tcW w:type="dxa" w:w="3600"/>
+            <w:shd w:val="clear" w:color="auto" w:fill="FFFFFF"/>
+          </w:tcPr>
+          <w:p>
+            <w:pPr>
+              <w:jc w:val="center"/>
+            </w:pPr>
+            <w:r>
+              <w:rPr>
+                <w:sz w:val="18"/>
+              </w:rPr>
+              <w:t>TOTAL handled by imputation</w:t>
+            </w:r>
+          </w:p>
+        </w:tc>
+        <w:tc>
+          <w:tcPr>
+            <w:tcW w:type="dxa" w:w="1008"/>
+            <w:shd w:val="clear" w:color="auto" w:fill="FFFFFF"/>
+          </w:tcPr>
+          <w:p>
+            <w:pPr>
+              <w:jc w:val="center"/>
+            </w:pPr>
+            <w:r>
+              <w:rPr>
+                <w:sz w:val="18"/>
+              </w:rPr>
+              <w:t>120</w:t>
+            </w:r>
+          </w:p>
+        </w:tc>
+        <w:tc>
+          <w:tcPr>
+            <w:tcW w:type="dxa" w:w="5328"/>
+            <w:shd w:val="clear" w:color="auto" w:fill="FFFFFF"/>
+          </w:tcPr>
+          <w:p>
+            <w:pPr>
+              <w:jc w:val="center"/>
+            </w:pPr>
+            <w:r>
+              <w:rPr>
+                <w:sz w:val="18"/>
+              </w:rPr>
+              <w:t>93 + 25 + 2 = 120</w:t>
+            </w:r>
+          </w:p>
+        </w:tc>
+      </w:tr>
+    </w:tbl>
+    <w:p/>
+    <w:tbl>
+      <w:tblPr>
+        <w:tblStyle w:val="TableGrid"/>
+        <w:tblW w:type="auto" w:w="0"/>
+        <w:jc w:val="center"/>
+        <w:tblLook w:firstColumn="1" w:firstRow="1" w:lastColumn="0" w:lastRow="0" w:noHBand="0" w:noVBand="1" w:val="04A0"/>
+      </w:tblPr>
+      <w:tblGrid>
+        <w:gridCol w:w="2340"/>
+        <w:gridCol w:w="2340"/>
+        <w:gridCol w:w="2340"/>
+        <w:gridCol w:w="2340"/>
+      </w:tblGrid>
+      <w:tr>
+        <w:tc>
+          <w:tcPr>
+            <w:tcW w:type="dxa" w:w="2448"/>
             <w:shd w:val="clear" w:color="auto" w:fill="1A355E"/>
           </w:tcPr>
           <w:p>
@@ -1147,7 +1665,7 @@
         </w:tc>
         <w:tc>
           <w:tcPr>
-            <w:tcW w:type="dxa" w:w="2016"/>
+            <w:tcW w:type="dxa" w:w="1440"/>
             <w:shd w:val="clear" w:color="auto" w:fill="1A355E"/>
           </w:tcPr>
           <w:p>
@@ -1160,13 +1678,32 @@
                 <w:color w:val="FFFFFF"/>
                 <w:sz w:val="18"/>
               </w:rPr>
-              <w:t>Missing Count</w:t>
+              <w:t>Type A NaN</w:t>
             </w:r>
           </w:p>
         </w:tc>
         <w:tc>
           <w:tcPr>
-            <w:tcW w:type="dxa" w:w="4608"/>
+            <w:tcW w:type="dxa" w:w="2880"/>
+            <w:shd w:val="clear" w:color="auto" w:fill="1A355E"/>
+          </w:tcPr>
+          <w:p>
+            <w:pPr>
+              <w:jc w:val="center"/>
+            </w:pPr>
+            <w:r>
+              <w:rPr>
+                <w:b/>
+                <w:color w:val="FFFFFF"/>
+                <w:sz w:val="18"/>
+              </w:rPr>
+              <w:t>Type B/C Additional NaN</w:t>
+            </w:r>
+          </w:p>
+        </w:tc>
+        <w:tc>
+          <w:tcPr>
+            <w:tcW w:type="dxa" w:w="3888"/>
             <w:shd w:val="clear" w:color="auto" w:fill="1A355E"/>
           </w:tcPr>
           <w:p>
@@ -1187,7 +1724,7 @@
       <w:tr>
         <w:tc>
           <w:tcPr>
-            <w:tcW w:type="dxa" w:w="2592"/>
+            <w:tcW w:type="dxa" w:w="2448"/>
             <w:shd w:val="clear" w:color="auto" w:fill="EEF3FA"/>
           </w:tcPr>
           <w:p>
@@ -1204,7 +1741,7 @@
         </w:tc>
         <w:tc>
           <w:tcPr>
-            <w:tcW w:type="dxa" w:w="2016"/>
+            <w:tcW w:type="dxa" w:w="1440"/>
             <w:shd w:val="clear" w:color="auto" w:fill="EEF3FA"/>
           </w:tcPr>
           <w:p>
@@ -1221,7 +1758,7 @@
         </w:tc>
         <w:tc>
           <w:tcPr>
-            <w:tcW w:type="dxa" w:w="4608"/>
+            <w:tcW w:type="dxa" w:w="2880"/>
             <w:shd w:val="clear" w:color="auto" w:fill="EEF3FA"/>
           </w:tcPr>
           <w:p>
@@ -1232,7 +1769,24 @@
               <w:rPr>
                 <w:sz w:val="18"/>
               </w:rPr>
-              <w:t>Mode imputation → most frequent category</w:t>
+              <w:t>0</w:t>
+            </w:r>
+          </w:p>
+        </w:tc>
+        <w:tc>
+          <w:tcPr>
+            <w:tcW w:type="dxa" w:w="3888"/>
+            <w:shd w:val="clear" w:color="auto" w:fill="EEF3FA"/>
+          </w:tcPr>
+          <w:p>
+            <w:pPr>
+              <w:jc w:val="center"/>
+            </w:pPr>
+            <w:r>
+              <w:rPr>
+                <w:sz w:val="18"/>
+              </w:rPr>
+              <w:t>Mode → most frequent category</w:t>
             </w:r>
           </w:p>
         </w:tc>
@@ -1240,7 +1794,7 @@
       <w:tr>
         <w:tc>
           <w:tcPr>
-            <w:tcW w:type="dxa" w:w="2592"/>
+            <w:tcW w:type="dxa" w:w="2448"/>
             <w:shd w:val="clear" w:color="auto" w:fill="FFFFFF"/>
           </w:tcPr>
           <w:p>
@@ -1257,7 +1811,7 @@
         </w:tc>
         <w:tc>
           <w:tcPr>
-            <w:tcW w:type="dxa" w:w="2016"/>
+            <w:tcW w:type="dxa" w:w="1440"/>
             <w:shd w:val="clear" w:color="auto" w:fill="FFFFFF"/>
           </w:tcPr>
           <w:p>
@@ -1274,7 +1828,7 @@
         </w:tc>
         <w:tc>
           <w:tcPr>
-            <w:tcW w:type="dxa" w:w="4608"/>
+            <w:tcW w:type="dxa" w:w="2880"/>
             <w:shd w:val="clear" w:color="auto" w:fill="FFFFFF"/>
           </w:tcPr>
           <w:p>
@@ -1285,7 +1839,24 @@
               <w:rPr>
                 <w:sz w:val="18"/>
               </w:rPr>
-              <w:t>Median imputation → central tendency of 0/1</w:t>
+              <w:t>0</w:t>
+            </w:r>
+          </w:p>
+        </w:tc>
+        <w:tc>
+          <w:tcPr>
+            <w:tcW w:type="dxa" w:w="3888"/>
+            <w:shd w:val="clear" w:color="auto" w:fill="FFFFFF"/>
+          </w:tcPr>
+          <w:p>
+            <w:pPr>
+              <w:jc w:val="center"/>
+            </w:pPr>
+            <w:r>
+              <w:rPr>
+                <w:sz w:val="18"/>
+              </w:rPr>
+              <w:t>Median → central tendency of binary 0/1</w:t>
             </w:r>
           </w:p>
         </w:tc>
@@ -1293,7 +1864,7 @@
       <w:tr>
         <w:tc>
           <w:tcPr>
-            <w:tcW w:type="dxa" w:w="2592"/>
+            <w:tcW w:type="dxa" w:w="2448"/>
             <w:shd w:val="clear" w:color="auto" w:fill="EEF3FA"/>
           </w:tcPr>
           <w:p>
@@ -1310,7 +1881,7 @@
         </w:tc>
         <w:tc>
           <w:tcPr>
-            <w:tcW w:type="dxa" w:w="2016"/>
+            <w:tcW w:type="dxa" w:w="1440"/>
             <w:shd w:val="clear" w:color="auto" w:fill="EEF3FA"/>
           </w:tcPr>
           <w:p>
@@ -1327,7 +1898,7 @@
         </w:tc>
         <w:tc>
           <w:tcPr>
-            <w:tcW w:type="dxa" w:w="4608"/>
+            <w:tcW w:type="dxa" w:w="2880"/>
             <w:shd w:val="clear" w:color="auto" w:fill="EEF3FA"/>
           </w:tcPr>
           <w:p>
@@ -1338,7 +1909,24 @@
               <w:rPr>
                 <w:sz w:val="18"/>
               </w:rPr>
-              <w:t>Median imputation → robust against extreme values</w:t>
+              <w:t>+1 (negative → NaN)</w:t>
+            </w:r>
+          </w:p>
+        </w:tc>
+        <w:tc>
+          <w:tcPr>
+            <w:tcW w:type="dxa" w:w="3888"/>
+            <w:shd w:val="clear" w:color="auto" w:fill="EEF3FA"/>
+          </w:tcPr>
+          <w:p>
+            <w:pPr>
+              <w:jc w:val="center"/>
+            </w:pPr>
+            <w:r>
+              <w:rPr>
+                <w:sz w:val="18"/>
+              </w:rPr>
+              <w:t>Median → robust against skewed values</w:t>
             </w:r>
           </w:p>
         </w:tc>
@@ -1346,7 +1934,7 @@
       <w:tr>
         <w:tc>
           <w:tcPr>
-            <w:tcW w:type="dxa" w:w="2592"/>
+            <w:tcW w:type="dxa" w:w="2448"/>
             <w:shd w:val="clear" w:color="auto" w:fill="FFFFFF"/>
           </w:tcPr>
           <w:p>
@@ -1363,7 +1951,7 @@
         </w:tc>
         <w:tc>
           <w:tcPr>
-            <w:tcW w:type="dxa" w:w="2016"/>
+            <w:tcW w:type="dxa" w:w="1440"/>
             <w:shd w:val="clear" w:color="auto" w:fill="FFFFFF"/>
           </w:tcPr>
           <w:p>
@@ -1380,7 +1968,7 @@
         </w:tc>
         <w:tc>
           <w:tcPr>
-            <w:tcW w:type="dxa" w:w="4608"/>
+            <w:tcW w:type="dxa" w:w="2880"/>
             <w:shd w:val="clear" w:color="auto" w:fill="FFFFFF"/>
           </w:tcPr>
           <w:p>
@@ -1391,7 +1979,24 @@
               <w:rPr>
                 <w:sz w:val="18"/>
               </w:rPr>
-              <w:t>Mode imputation → most frequent category</w:t>
+              <w:t>0</w:t>
+            </w:r>
+          </w:p>
+        </w:tc>
+        <w:tc>
+          <w:tcPr>
+            <w:tcW w:type="dxa" w:w="3888"/>
+            <w:shd w:val="clear" w:color="auto" w:fill="FFFFFF"/>
+          </w:tcPr>
+          <w:p>
+            <w:pPr>
+              <w:jc w:val="center"/>
+            </w:pPr>
+            <w:r>
+              <w:rPr>
+                <w:sz w:val="18"/>
+              </w:rPr>
+              <w:t>Mode → most frequent category</w:t>
             </w:r>
           </w:p>
         </w:tc>
@@ -1399,7 +2004,7 @@
       <w:tr>
         <w:tc>
           <w:tcPr>
-            <w:tcW w:type="dxa" w:w="2592"/>
+            <w:tcW w:type="dxa" w:w="2448"/>
             <w:shd w:val="clear" w:color="auto" w:fill="EEF3FA"/>
           </w:tcPr>
           <w:p>
@@ -1416,7 +2021,7 @@
         </w:tc>
         <w:tc>
           <w:tcPr>
-            <w:tcW w:type="dxa" w:w="2016"/>
+            <w:tcW w:type="dxa" w:w="1440"/>
             <w:shd w:val="clear" w:color="auto" w:fill="EEF3FA"/>
           </w:tcPr>
           <w:p>
@@ -1433,7 +2038,7 @@
         </w:tc>
         <w:tc>
           <w:tcPr>
-            <w:tcW w:type="dxa" w:w="4608"/>
+            <w:tcW w:type="dxa" w:w="2880"/>
             <w:shd w:val="clear" w:color="auto" w:fill="EEF3FA"/>
           </w:tcPr>
           <w:p>
@@ -1444,7 +2049,24 @@
               <w:rPr>
                 <w:sz w:val="18"/>
               </w:rPr>
-              <w:t>Median imputation → robust against outliers</w:t>
+              <w:t>+1 (negative → NaN)</w:t>
+            </w:r>
+          </w:p>
+        </w:tc>
+        <w:tc>
+          <w:tcPr>
+            <w:tcW w:type="dxa" w:w="3888"/>
+            <w:shd w:val="clear" w:color="auto" w:fill="EEF3FA"/>
+          </w:tcPr>
+          <w:p>
+            <w:pPr>
+              <w:jc w:val="center"/>
+            </w:pPr>
+            <w:r>
+              <w:rPr>
+                <w:sz w:val="18"/>
+              </w:rPr>
+              <w:t>Median → robust against outliers</w:t>
             </w:r>
           </w:p>
         </w:tc>
@@ -1452,7 +2074,7 @@
       <w:tr>
         <w:tc>
           <w:tcPr>
-            <w:tcW w:type="dxa" w:w="2592"/>
+            <w:tcW w:type="dxa" w:w="2448"/>
             <w:shd w:val="clear" w:color="auto" w:fill="FFFFFF"/>
           </w:tcPr>
           <w:p>
@@ -1469,7 +2091,7 @@
         </w:tc>
         <w:tc>
           <w:tcPr>
-            <w:tcW w:type="dxa" w:w="2016"/>
+            <w:tcW w:type="dxa" w:w="1440"/>
             <w:shd w:val="clear" w:color="auto" w:fill="FFFFFF"/>
           </w:tcPr>
           <w:p>
@@ -1480,13 +2102,13 @@
               <w:rPr>
                 <w:sz w:val="18"/>
               </w:rPr>
-              <w:t>~25 blank strings</w:t>
+              <w:t>0</w:t>
             </w:r>
           </w:p>
         </w:tc>
         <w:tc>
           <w:tcPr>
-            <w:tcW w:type="dxa" w:w="4608"/>
+            <w:tcW w:type="dxa" w:w="2880"/>
             <w:shd w:val="clear" w:color="auto" w:fill="FFFFFF"/>
           </w:tcPr>
           <w:p>
@@ -1497,7 +2119,94 @@
               <w:rPr>
                 <w:sz w:val="18"/>
               </w:rPr>
-              <w:t>Coerced to NaN → Median imputation</w:t>
+              <w:t>+25 (blank strings → NaN)</w:t>
+            </w:r>
+          </w:p>
+        </w:tc>
+        <w:tc>
+          <w:tcPr>
+            <w:tcW w:type="dxa" w:w="3888"/>
+            <w:shd w:val="clear" w:color="auto" w:fill="FFFFFF"/>
+          </w:tcPr>
+          <w:p>
+            <w:pPr>
+              <w:jc w:val="center"/>
+            </w:pPr>
+            <w:r>
+              <w:rPr>
+                <w:sz w:val="18"/>
+              </w:rPr>
+              <w:t>Median → after float64 conversion</w:t>
+            </w:r>
+          </w:p>
+        </w:tc>
+      </w:tr>
+      <w:tr>
+        <w:tc>
+          <w:tcPr>
+            <w:tcW w:type="dxa" w:w="2448"/>
+            <w:shd w:val="clear" w:color="auto" w:fill="EEF3FA"/>
+          </w:tcPr>
+          <w:p>
+            <w:pPr>
+              <w:jc w:val="center"/>
+            </w:pPr>
+            <w:r>
+              <w:rPr>
+                <w:sz w:val="18"/>
+              </w:rPr>
+              <w:t>TOTAL</w:t>
+            </w:r>
+          </w:p>
+        </w:tc>
+        <w:tc>
+          <w:tcPr>
+            <w:tcW w:type="dxa" w:w="1440"/>
+            <w:shd w:val="clear" w:color="auto" w:fill="EEF3FA"/>
+          </w:tcPr>
+          <w:p>
+            <w:pPr>
+              <w:jc w:val="center"/>
+            </w:pPr>
+            <w:r>
+              <w:rPr>
+                <w:sz w:val="18"/>
+              </w:rPr>
+              <w:t>93</w:t>
+            </w:r>
+          </w:p>
+        </w:tc>
+        <w:tc>
+          <w:tcPr>
+            <w:tcW w:type="dxa" w:w="2880"/>
+            <w:shd w:val="clear" w:color="auto" w:fill="EEF3FA"/>
+          </w:tcPr>
+          <w:p>
+            <w:pPr>
+              <w:jc w:val="center"/>
+            </w:pPr>
+            <w:r>
+              <w:rPr>
+                <w:sz w:val="18"/>
+              </w:rPr>
+              <w:t>+27</w:t>
+            </w:r>
+          </w:p>
+        </w:tc>
+        <w:tc>
+          <w:tcPr>
+            <w:tcW w:type="dxa" w:w="3888"/>
+            <w:shd w:val="clear" w:color="auto" w:fill="EEF3FA"/>
+          </w:tcPr>
+          <w:p>
+            <w:pPr>
+              <w:jc w:val="center"/>
+            </w:pPr>
+            <w:r>
+              <w:rPr>
+                <w:sz w:val="18"/>
+              </w:rPr>
+              <w:t>All 120 handled</w:t>
             </w:r>
           </w:p>
         </w:tc>
@@ -1510,7 +2219,7 @@
           <w:color w:val="1C1C2E"/>
           <w:sz w:val="20"/>
         </w:rPr>
-        <w:t>Strategy rationale: Median imputation is preferred over mean for numerical columns because median is resistant to the extreme outlier values injected in MonthlyCharges and TenureMonths. Mode imputation is used for categorical columns to maintain the most probable categorical assignment.</w:t>
+        <w:t>Strategy rationale: Median imputation is preferred over mean for numerical columns because median is resistant to the extreme outlier values (9,999.0, 4,500.0, 350) still present in MonthlyCharges and TenureMonths at the time of imputation. Mode imputation is used for categorical columns (Gender, PaymentMethod) to assign the most probable category.</w:t>
       </w:r>
     </w:p>
     <w:p>
@@ -1531,7 +2240,7 @@
           <w:color w:val="1C1C2E"/>
           <w:sz w:val="20"/>
         </w:rPr>
-        <w:t>The raw dataset contains 10 duplicate rows. Deduplication is performed by checking for duplicate CustomerID values, keeping the first occurrence. After removal: 1210 → 1200 rows (1200 unique records).</w:t>
+        <w:t>The raw dataset contains 10 duplicate rows injected during dataset generation. Deduplication is performed by checking for duplicate CustomerID values (keep='first'). After removal: 1210 rows → 1200 rows (1200 unique records).</w:t>
       </w:r>
     </w:p>
     <w:p/>
@@ -1553,7 +2262,7 @@
           <w:color w:val="1C1C2E"/>
           <w:sz w:val="20"/>
         </w:rPr>
-        <w:t>Gender values contain case inconsistencies and abbreviations ('female', 'F', 'male', 'M'). A dictionary mapping normalises all variants to canonical 'Male' / 'Female' values before encoding. TotalCharges blank strings are stripped and coerced to NaN, then converted to float64 dtype.</w:t>
+        <w:t>Gender values contain case inconsistencies and abbreviations ('female', 'F', 'male', 'M'). A dictionary mapping normalises all variants to canonical 'Male' / 'Female' before encoding. TotalCharges blank strings are stripped and pd.to_numeric(errors='coerce') converts them to NaN, enabling subsequent median imputation and float64 type conversion.</w:t>
       </w:r>
     </w:p>
     <w:p/>
@@ -1575,7 +2284,79 @@
           <w:color w:val="1C1C2E"/>
           <w:sz w:val="20"/>
         </w:rPr>
-        <w:t>Outliers are detected using the 1.5×IQR boundary rule and capped (Winsorised) to the boundary values — preserving all rows while eliminating distorting extremes.</w:t>
+        <w:t>The pipeline handles abnormal numerical values in two distinct stages that must not be confused:</w:t>
+      </w:r>
+    </w:p>
+    <w:p/>
+    <w:p>
+      <w:r>
+        <w:rPr>
+          <w:b/>
+          <w:color w:val="2B5C8F"/>
+          <w:sz w:val="20"/>
+        </w:rPr>
+        <w:t>Stage A — Invalid Value Correction (clean_initial_formatting)</w:t>
+      </w:r>
+    </w:p>
+    <w:p>
+      <w:pPr>
+        <w:ind w:left="432"/>
+      </w:pPr>
+      <w:r>
+        <w:rPr>
+          <w:color w:val="1C1C2E"/>
+          <w:sz w:val="20"/>
+        </w:rPr>
+        <w:t>Physically impossible values are detected and set to NaN before any IQR analysis. These are NOT outlier-capped — they are treated as data entry errors and subsequently handled by median imputation:</w:t>
+      </w:r>
+    </w:p>
+    <w:p>
+      <w:pPr>
+        <w:pStyle w:val="ListBullet"/>
+        <w:ind w:left="720"/>
+      </w:pPr>
+      <w:r>
+        <w:rPr>
+          <w:color w:val="1C1C2E"/>
+          <w:sz w:val="20"/>
+        </w:rPr>
+        <w:t>MonthlyCharges = −150.0  →  set to NaN  →  imputed with column median</w:t>
+      </w:r>
+    </w:p>
+    <w:p>
+      <w:pPr>
+        <w:pStyle w:val="ListBullet"/>
+        <w:ind w:left="720"/>
+      </w:pPr>
+      <w:r>
+        <w:rPr>
+          <w:color w:val="1C1C2E"/>
+          <w:sz w:val="20"/>
+        </w:rPr>
+        <w:t>TenureMonths   = −12.0   →  set to NaN  →  imputed with column median</w:t>
+      </w:r>
+    </w:p>
+    <w:p/>
+    <w:p>
+      <w:r>
+        <w:rPr>
+          <w:b/>
+          <w:color w:val="2B5C8F"/>
+          <w:sz w:val="20"/>
+        </w:rPr>
+        <w:t>Stage B — IQR-Based Outlier Capping (detect_and_cap_outliers)</w:t>
+      </w:r>
+    </w:p>
+    <w:p>
+      <w:pPr>
+        <w:ind w:left="432"/>
+      </w:pPr>
+      <w:r>
+        <w:rPr>
+          <w:color w:val="1C1C2E"/>
+          <w:sz w:val="20"/>
+        </w:rPr>
+        <w:t>After formatting and imputation, extreme but potentially real values are detected using the 1.5×IQR boundary rule and capped (Winsorised) to the boundary. This preserves all records while eliminating distorting extremes.</w:t>
       </w:r>
     </w:p>
     <w:p/>
@@ -1587,13 +2368,11 @@
         <w:tblLook w:firstColumn="1" w:firstRow="1" w:lastColumn="0" w:lastRow="0" w:noHBand="0" w:noVBand="1" w:val="04A0"/>
       </w:tblPr>
       <w:tblGrid>
-        <w:gridCol w:w="1337"/>
-        <w:gridCol w:w="1337"/>
-        <w:gridCol w:w="1337"/>
-        <w:gridCol w:w="1337"/>
-        <w:gridCol w:w="1337"/>
-        <w:gridCol w:w="1337"/>
-        <w:gridCol w:w="1337"/>
+        <w:gridCol w:w="1872"/>
+        <w:gridCol w:w="1872"/>
+        <w:gridCol w:w="1872"/>
+        <w:gridCol w:w="1872"/>
+        <w:gridCol w:w="1872"/>
       </w:tblGrid>
       <w:tr>
         <w:tc>
@@ -1617,7 +2396,7 @@
         </w:tc>
         <w:tc>
           <w:tcPr>
-            <w:tcW w:type="dxa" w:w="1152"/>
+            <w:tcW w:type="dxa" w:w="1440"/>
             <w:shd w:val="clear" w:color="auto" w:fill="1A355E"/>
           </w:tcPr>
           <w:p>
@@ -1630,13 +2409,13 @@
                 <w:color w:val="FFFFFF"/>
                 <w:sz w:val="18"/>
               </w:rPr>
-              <w:t>Q1</w:t>
+              <w:t>IQR Lower</w:t>
             </w:r>
           </w:p>
         </w:tc>
         <w:tc>
           <w:tcPr>
-            <w:tcW w:type="dxa" w:w="1152"/>
+            <w:tcW w:type="dxa" w:w="1440"/>
             <w:shd w:val="clear" w:color="auto" w:fill="1A355E"/>
           </w:tcPr>
           <w:p>
@@ -1649,13 +2428,13 @@
                 <w:color w:val="FFFFFF"/>
                 <w:sz w:val="18"/>
               </w:rPr>
-              <w:t>Q3</w:t>
+              <w:t>IQR Upper</w:t>
             </w:r>
           </w:p>
         </w:tc>
         <w:tc>
           <w:tcPr>
-            <w:tcW w:type="dxa" w:w="1152"/>
+            <w:tcW w:type="dxa" w:w="4032"/>
             <w:shd w:val="clear" w:color="auto" w:fill="1A355E"/>
           </w:tcPr>
           <w:p>
@@ -1668,13 +2447,13 @@
                 <w:color w:val="FFFFFF"/>
                 <w:sz w:val="18"/>
               </w:rPr>
-              <w:t>IQR</w:t>
+              <w:t>Values Capped</w:t>
             </w:r>
           </w:p>
         </w:tc>
         <w:tc>
           <w:tcPr>
-            <w:tcW w:type="dxa" w:w="1584"/>
+            <w:tcW w:type="dxa" w:w="1296"/>
             <w:shd w:val="clear" w:color="auto" w:fill="1A355E"/>
           </w:tcPr>
           <w:p>
@@ -1687,45 +2466,7 @@
                 <w:color w:val="FFFFFF"/>
                 <w:sz w:val="18"/>
               </w:rPr>
-              <w:t>Lower Bound</w:t>
-            </w:r>
-          </w:p>
-        </w:tc>
-        <w:tc>
-          <w:tcPr>
-            <w:tcW w:type="dxa" w:w="1584"/>
-            <w:shd w:val="clear" w:color="auto" w:fill="1A355E"/>
-          </w:tcPr>
-          <w:p>
-            <w:pPr>
-              <w:jc w:val="center"/>
-            </w:pPr>
-            <w:r>
-              <w:rPr>
-                <w:b/>
-                <w:color w:val="FFFFFF"/>
-                <w:sz w:val="18"/>
-              </w:rPr>
-              <w:t>Upper Bound</w:t>
-            </w:r>
-          </w:p>
-        </w:tc>
-        <w:tc>
-          <w:tcPr>
-            <w:tcW w:type="dxa" w:w="1584"/>
-            <w:shd w:val="clear" w:color="auto" w:fill="1A355E"/>
-          </w:tcPr>
-          <w:p>
-            <w:pPr>
-              <w:jc w:val="center"/>
-            </w:pPr>
-            <w:r>
-              <w:rPr>
-                <w:b/>
-                <w:color w:val="FFFFFF"/>
-                <w:sz w:val="18"/>
-              </w:rPr>
-              <w:t>Outliers Capped</w:t>
+              <w:t>Cap Count</w:t>
             </w:r>
           </w:p>
         </w:tc>
@@ -1750,7 +2491,7 @@
         </w:tc>
         <w:tc>
           <w:tcPr>
-            <w:tcW w:type="dxa" w:w="1152"/>
+            <w:tcW w:type="dxa" w:w="1440"/>
             <w:shd w:val="clear" w:color="auto" w:fill="EEF3FA"/>
           </w:tcPr>
           <w:p>
@@ -1761,13 +2502,13 @@
               <w:rPr>
                 <w:sz w:val="18"/>
               </w:rPr>
-              <w:t>$58.52</w:t>
+              <w:t>$5.57</w:t>
             </w:r>
           </w:p>
         </w:tc>
         <w:tc>
           <w:tcPr>
-            <w:tcW w:type="dxa" w:w="1152"/>
+            <w:tcW w:type="dxa" w:w="1440"/>
             <w:shd w:val="clear" w:color="auto" w:fill="EEF3FA"/>
           </w:tcPr>
           <w:p>
@@ -1778,13 +2519,13 @@
               <w:rPr>
                 <w:sz w:val="18"/>
               </w:rPr>
-              <w:t>$94.28</w:t>
+              <w:t>$147.12</w:t>
             </w:r>
           </w:p>
         </w:tc>
         <w:tc>
           <w:tcPr>
-            <w:tcW w:type="dxa" w:w="1152"/>
+            <w:tcW w:type="dxa" w:w="4032"/>
             <w:shd w:val="clear" w:color="auto" w:fill="EEF3FA"/>
           </w:tcPr>
           <w:p>
@@ -1795,13 +2536,13 @@
               <w:rPr>
                 <w:sz w:val="18"/>
               </w:rPr>
-              <w:t>$35.76</w:t>
+              <w:t>9,999.0 → $147.12;  4,500.0 → $147.12</w:t>
             </w:r>
           </w:p>
         </w:tc>
         <w:tc>
           <w:tcPr>
-            <w:tcW w:type="dxa" w:w="1584"/>
+            <w:tcW w:type="dxa" w:w="1296"/>
             <w:shd w:val="clear" w:color="auto" w:fill="EEF3FA"/>
           </w:tcPr>
           <w:p>
@@ -1812,41 +2553,7 @@
               <w:rPr>
                 <w:sz w:val="18"/>
               </w:rPr>
-              <w:t>$4.89</w:t>
-            </w:r>
-          </w:p>
-        </w:tc>
-        <w:tc>
-          <w:tcPr>
-            <w:tcW w:type="dxa" w:w="1584"/>
-            <w:shd w:val="clear" w:color="auto" w:fill="EEF3FA"/>
-          </w:tcPr>
-          <w:p>
-            <w:pPr>
-              <w:jc w:val="center"/>
-            </w:pPr>
-            <w:r>
-              <w:rPr>
-                <w:sz w:val="18"/>
-              </w:rPr>
-              <w:t>$147.91</w:t>
-            </w:r>
-          </w:p>
-        </w:tc>
-        <w:tc>
-          <w:tcPr>
-            <w:tcW w:type="dxa" w:w="1584"/>
-            <w:shd w:val="clear" w:color="auto" w:fill="EEF3FA"/>
-          </w:tcPr>
-          <w:p>
-            <w:pPr>
-              <w:jc w:val="center"/>
-            </w:pPr>
-            <w:r>
-              <w:rPr>
-                <w:sz w:val="18"/>
-              </w:rPr>
-              <w:t>3</w:t>
+              <w:t>2</w:t>
             </w:r>
           </w:p>
         </w:tc>
@@ -1871,7 +2578,7 @@
         </w:tc>
         <w:tc>
           <w:tcPr>
-            <w:tcW w:type="dxa" w:w="1152"/>
+            <w:tcW w:type="dxa" w:w="1440"/>
             <w:shd w:val="clear" w:color="auto" w:fill="FFFFFF"/>
           </w:tcPr>
           <w:p>
@@ -1882,13 +2589,13 @@
               <w:rPr>
                 <w:sz w:val="18"/>
               </w:rPr>
-              <w:t>18.75m</w:t>
+              <w:t>-33.5m</w:t>
             </w:r>
           </w:p>
         </w:tc>
         <w:tc>
           <w:tcPr>
-            <w:tcW w:type="dxa" w:w="1152"/>
+            <w:tcW w:type="dxa" w:w="1440"/>
             <w:shd w:val="clear" w:color="auto" w:fill="FFFFFF"/>
           </w:tcPr>
           <w:p>
@@ -1899,13 +2606,13 @@
               <w:rPr>
                 <w:sz w:val="18"/>
               </w:rPr>
-              <w:t>54.0m</w:t>
+              <w:t>106.5m</w:t>
             </w:r>
           </w:p>
         </w:tc>
         <w:tc>
           <w:tcPr>
-            <w:tcW w:type="dxa" w:w="1152"/>
+            <w:tcW w:type="dxa" w:w="4032"/>
             <w:shd w:val="clear" w:color="auto" w:fill="FFFFFF"/>
           </w:tcPr>
           <w:p>
@@ -1916,47 +2623,13 @@
               <w:rPr>
                 <w:sz w:val="18"/>
               </w:rPr>
-              <w:t>35.25m</w:t>
+              <w:t>350 months → 106.50 months</w:t>
             </w:r>
           </w:p>
         </w:tc>
         <w:tc>
           <w:tcPr>
-            <w:tcW w:type="dxa" w:w="1584"/>
-            <w:shd w:val="clear" w:color="auto" w:fill="FFFFFF"/>
-          </w:tcPr>
-          <w:p>
-            <w:pPr>
-              <w:jc w:val="center"/>
-            </w:pPr>
-            <w:r>
-              <w:rPr>
-                <w:sz w:val="18"/>
-              </w:rPr>
-              <w:t>-34.12m</w:t>
-            </w:r>
-          </w:p>
-        </w:tc>
-        <w:tc>
-          <w:tcPr>
-            <w:tcW w:type="dxa" w:w="1584"/>
-            <w:shd w:val="clear" w:color="auto" w:fill="FFFFFF"/>
-          </w:tcPr>
-          <w:p>
-            <w:pPr>
-              <w:jc w:val="center"/>
-            </w:pPr>
-            <w:r>
-              <w:rPr>
-                <w:sz w:val="18"/>
-              </w:rPr>
-              <w:t>106.88m</w:t>
-            </w:r>
-          </w:p>
-        </w:tc>
-        <w:tc>
-          <w:tcPr>
-            <w:tcW w:type="dxa" w:w="1584"/>
+            <w:tcW w:type="dxa" w:w="1296"/>
             <w:shd w:val="clear" w:color="auto" w:fill="FFFFFF"/>
           </w:tcPr>
           <w:p>
@@ -1992,7 +2665,7 @@
         </w:tc>
         <w:tc>
           <w:tcPr>
-            <w:tcW w:type="dxa" w:w="1152"/>
+            <w:tcW w:type="dxa" w:w="1440"/>
             <w:shd w:val="clear" w:color="auto" w:fill="EEF3FA"/>
           </w:tcPr>
           <w:p>
@@ -2003,13 +2676,13 @@
               <w:rPr>
                 <w:sz w:val="18"/>
               </w:rPr>
-              <w:t>$1,097</w:t>
+              <w:t>$-3,174</w:t>
             </w:r>
           </w:p>
         </w:tc>
         <w:tc>
           <w:tcPr>
-            <w:tcW w:type="dxa" w:w="1152"/>
+            <w:tcW w:type="dxa" w:w="1440"/>
             <w:shd w:val="clear" w:color="auto" w:fill="EEF3FA"/>
           </w:tcPr>
           <w:p>
@@ -2020,13 +2693,13 @@
               <w:rPr>
                 <w:sz w:val="18"/>
               </w:rPr>
-              <w:t>$4,044</w:t>
+              <w:t>$8,264</w:t>
             </w:r>
           </w:p>
         </w:tc>
         <w:tc>
           <w:tcPr>
-            <w:tcW w:type="dxa" w:w="1152"/>
+            <w:tcW w:type="dxa" w:w="4032"/>
             <w:shd w:val="clear" w:color="auto" w:fill="EEF3FA"/>
           </w:tcPr>
           <w:p>
@@ -2037,47 +2710,13 @@
               <w:rPr>
                 <w:sz w:val="18"/>
               </w:rPr>
-              <w:t>$2,947</w:t>
+              <w:t>No values exceeded IQR bounds</w:t>
             </w:r>
           </w:p>
         </w:tc>
         <w:tc>
           <w:tcPr>
-            <w:tcW w:type="dxa" w:w="1584"/>
-            <w:shd w:val="clear" w:color="auto" w:fill="EEF3FA"/>
-          </w:tcPr>
-          <w:p>
-            <w:pPr>
-              <w:jc w:val="center"/>
-            </w:pPr>
-            <w:r>
-              <w:rPr>
-                <w:sz w:val="18"/>
-              </w:rPr>
-              <w:t>$-3,323</w:t>
-            </w:r>
-          </w:p>
-        </w:tc>
-        <w:tc>
-          <w:tcPr>
-            <w:tcW w:type="dxa" w:w="1584"/>
-            <w:shd w:val="clear" w:color="auto" w:fill="EEF3FA"/>
-          </w:tcPr>
-          <w:p>
-            <w:pPr>
-              <w:jc w:val="center"/>
-            </w:pPr>
-            <w:r>
-              <w:rPr>
-                <w:sz w:val="18"/>
-              </w:rPr>
-              <w:t>$8,464</w:t>
-            </w:r>
-          </w:p>
-        </w:tc>
-        <w:tc>
-          <w:tcPr>
-            <w:tcW w:type="dxa" w:w="1584"/>
+            <w:tcW w:type="dxa" w:w="1296"/>
             <w:shd w:val="clear" w:color="auto" w:fill="EEF3FA"/>
           </w:tcPr>
           <w:p>
@@ -2093,6 +2732,93 @@
           </w:p>
         </w:tc>
       </w:tr>
+      <w:tr>
+        <w:tc>
+          <w:tcPr>
+            <w:tcW w:type="dxa" w:w="2160"/>
+            <w:shd w:val="clear" w:color="auto" w:fill="FFFFFF"/>
+          </w:tcPr>
+          <w:p>
+            <w:pPr>
+              <w:jc w:val="center"/>
+            </w:pPr>
+            <w:r>
+              <w:rPr>
+                <w:sz w:val="18"/>
+              </w:rPr>
+              <w:t>TOTAL</w:t>
+            </w:r>
+          </w:p>
+        </w:tc>
+        <w:tc>
+          <w:tcPr>
+            <w:tcW w:type="dxa" w:w="1440"/>
+            <w:shd w:val="clear" w:color="auto" w:fill="FFFFFF"/>
+          </w:tcPr>
+          <w:p>
+            <w:pPr>
+              <w:jc w:val="center"/>
+            </w:pPr>
+            <w:r>
+              <w:rPr>
+                <w:sz w:val="18"/>
+              </w:rPr>
+              <w:t>—</w:t>
+            </w:r>
+          </w:p>
+        </w:tc>
+        <w:tc>
+          <w:tcPr>
+            <w:tcW w:type="dxa" w:w="1440"/>
+            <w:shd w:val="clear" w:color="auto" w:fill="FFFFFF"/>
+          </w:tcPr>
+          <w:p>
+            <w:pPr>
+              <w:jc w:val="center"/>
+            </w:pPr>
+            <w:r>
+              <w:rPr>
+                <w:sz w:val="18"/>
+              </w:rPr>
+              <w:t>—</w:t>
+            </w:r>
+          </w:p>
+        </w:tc>
+        <w:tc>
+          <w:tcPr>
+            <w:tcW w:type="dxa" w:w="4032"/>
+            <w:shd w:val="clear" w:color="auto" w:fill="FFFFFF"/>
+          </w:tcPr>
+          <w:p>
+            <w:pPr>
+              <w:jc w:val="center"/>
+            </w:pPr>
+            <w:r>
+              <w:rPr>
+                <w:sz w:val="18"/>
+              </w:rPr>
+              <w:t>—</w:t>
+            </w:r>
+          </w:p>
+        </w:tc>
+        <w:tc>
+          <w:tcPr>
+            <w:tcW w:type="dxa" w:w="1296"/>
+            <w:shd w:val="clear" w:color="auto" w:fill="FFFFFF"/>
+          </w:tcPr>
+          <w:p>
+            <w:pPr>
+              <w:jc w:val="center"/>
+            </w:pPr>
+            <w:r>
+              <w:rPr>
+                <w:sz w:val="18"/>
+              </w:rPr>
+              <w:t>3</w:t>
+            </w:r>
+          </w:p>
+        </w:tc>
+      </w:tr>
     </w:tbl>
     <w:p/>
     <w:p>
@@ -2101,7 +2827,7 @@
           <w:color w:val="1C1C2E"/>
           <w:sz w:val="20"/>
         </w:rPr>
-        <w:t>In total, 4 values were capped via IQR-based capping. Specifically: MonthlyCharges values of 9,999.0 and 4,500.0 were capped to the upper bound ($147.91); the value of −150.0 (negative) was first set to NaN during cleaning, then imputed via median. TenureMonths value of 350 was capped to the upper bound (106.88m); the value of −12 was set to NaN during cleaning, then imputed via median.</w:t>
+        <w:t>Summary: 2 invalid negative values were corrected to NaN and subsequently imputed (Stage A). 3 extreme-but-real values were IQR-capped (Stage B). In total, 5 anomalous numerical values were addressed across the two stages.</w:t>
       </w:r>
     </w:p>
     <w:p>
@@ -2153,7 +2879,7 @@
           <w:color w:val="555555"/>
           <w:sz w:val="18"/>
         </w:rPr>
-        <w:t>Figure 2. Box plots comparing MonthlyCharges and TenureMonths before and after IQR-based capping. Note the extreme outlier values compressed to the IQR boundary after treatment.</w:t>
+        <w:t>Figure 2. Box plots comparing MonthlyCharges and TenureMonths before and after preprocessing. Left panels show raw data with extreme outliers; right panels show values after IQR-based capping and StandardScaler normalisation. 3 values were IQR-capped; 2 negative values were removed and imputed.</w:t>
       </w:r>
     </w:p>
     <w:p/>
@@ -2346,7 +3072,7 @@
           <w:color w:val="1C1C2E"/>
           <w:sz w:val="20"/>
         </w:rPr>
-        <w:t>After feature selection: 19 → 16 columns remain for modelling.</w:t>
+        <w:t>After feature selection: 19 columns → 16 columns remain for modelling.</w:t>
       </w:r>
     </w:p>
     <w:p/>
@@ -2382,15 +3108,6 @@
           <w:color w:val="2B5C8F"/>
         </w:rPr>
         <w:t>7.1  Binary Label Encoding (0/1)</w:t>
-      </w:r>
-    </w:p>
-    <w:p>
-      <w:r>
-        <w:rPr>
-          <w:color w:val="1C1C2E"/>
-          <w:sz w:val="20"/>
-        </w:rPr>
-        <w:t>Columns with exactly two distinct values are mapped to integer 0 / 1:</w:t>
       </w:r>
     </w:p>
     <w:tbl>
@@ -2511,7 +3228,7 @@
               <w:rPr>
                 <w:sz w:val="18"/>
               </w:rPr>
-              <w:t>0 → 0, 1 → 1 (already binary)</w:t>
+              <w:t>0 → 0, 1 → 1 (already binary integer)</w:t>
             </w:r>
           </w:p>
         </w:tc>
@@ -2753,7 +3470,7 @@
         </w:tc>
         <w:tc>
           <w:tcPr>
-            <w:tcW w:type="dxa" w:w="3744"/>
+            <w:tcW w:type="dxa" w:w="4032"/>
             <w:shd w:val="clear" w:color="auto" w:fill="1A355E"/>
           </w:tcPr>
           <w:p>
@@ -2772,7 +3489,7 @@
         </w:tc>
         <w:tc>
           <w:tcPr>
-            <w:tcW w:type="dxa" w:w="3168"/>
+            <w:tcW w:type="dxa" w:w="2880"/>
             <w:shd w:val="clear" w:color="auto" w:fill="1A355E"/>
           </w:tcPr>
           <w:p>
@@ -2785,7 +3502,7 @@
                 <w:color w:val="FFFFFF"/>
                 <w:sz w:val="18"/>
               </w:rPr>
-              <w:t>Columns After Encoding</w:t>
+              <w:t>New Indicator Columns</w:t>
             </w:r>
           </w:p>
         </w:tc>
@@ -2810,7 +3527,7 @@
         </w:tc>
         <w:tc>
           <w:tcPr>
-            <w:tcW w:type="dxa" w:w="3744"/>
+            <w:tcW w:type="dxa" w:w="4032"/>
             <w:shd w:val="clear" w:color="auto" w:fill="EEF3FA"/>
           </w:tcPr>
           <w:p>
@@ -2827,7 +3544,7 @@
         </w:tc>
         <w:tc>
           <w:tcPr>
-            <w:tcW w:type="dxa" w:w="3168"/>
+            <w:tcW w:type="dxa" w:w="2880"/>
             <w:shd w:val="clear" w:color="auto" w:fill="EEF3FA"/>
           </w:tcPr>
           <w:p>
@@ -2838,7 +3555,7 @@
               <w:rPr>
                 <w:sz w:val="18"/>
               </w:rPr>
-              <w:t>2 indicator columns</w:t>
+              <w:t>2</w:t>
             </w:r>
           </w:p>
         </w:tc>
@@ -2863,7 +3580,7 @@
         </w:tc>
         <w:tc>
           <w:tcPr>
-            <w:tcW w:type="dxa" w:w="3744"/>
+            <w:tcW w:type="dxa" w:w="4032"/>
             <w:shd w:val="clear" w:color="auto" w:fill="FFFFFF"/>
           </w:tcPr>
           <w:p>
@@ -2880,7 +3597,7 @@
         </w:tc>
         <w:tc>
           <w:tcPr>
-            <w:tcW w:type="dxa" w:w="3168"/>
+            <w:tcW w:type="dxa" w:w="2880"/>
             <w:shd w:val="clear" w:color="auto" w:fill="FFFFFF"/>
           </w:tcPr>
           <w:p>
@@ -2891,7 +3608,7 @@
               <w:rPr>
                 <w:sz w:val="18"/>
               </w:rPr>
-              <w:t>2 indicator columns</w:t>
+              <w:t>2</w:t>
             </w:r>
           </w:p>
         </w:tc>
@@ -2916,7 +3633,7 @@
         </w:tc>
         <w:tc>
           <w:tcPr>
-            <w:tcW w:type="dxa" w:w="3744"/>
+            <w:tcW w:type="dxa" w:w="4032"/>
             <w:shd w:val="clear" w:color="auto" w:fill="EEF3FA"/>
           </w:tcPr>
           <w:p>
@@ -2933,7 +3650,7 @@
         </w:tc>
         <w:tc>
           <w:tcPr>
-            <w:tcW w:type="dxa" w:w="3168"/>
+            <w:tcW w:type="dxa" w:w="2880"/>
             <w:shd w:val="clear" w:color="auto" w:fill="EEF3FA"/>
           </w:tcPr>
           <w:p>
@@ -2944,7 +3661,7 @@
               <w:rPr>
                 <w:sz w:val="18"/>
               </w:rPr>
-              <w:t>2 indicator columns</w:t>
+              <w:t>2</w:t>
             </w:r>
           </w:p>
         </w:tc>
@@ -2969,7 +3686,7 @@
         </w:tc>
         <w:tc>
           <w:tcPr>
-            <w:tcW w:type="dxa" w:w="3744"/>
+            <w:tcW w:type="dxa" w:w="4032"/>
             <w:shd w:val="clear" w:color="auto" w:fill="FFFFFF"/>
           </w:tcPr>
           <w:p>
@@ -2986,7 +3703,7 @@
         </w:tc>
         <w:tc>
           <w:tcPr>
-            <w:tcW w:type="dxa" w:w="3168"/>
+            <w:tcW w:type="dxa" w:w="2880"/>
             <w:shd w:val="clear" w:color="auto" w:fill="FFFFFF"/>
           </w:tcPr>
           <w:p>
@@ -2997,7 +3714,7 @@
               <w:rPr>
                 <w:sz w:val="18"/>
               </w:rPr>
-              <w:t>2 indicator columns</w:t>
+              <w:t>2</w:t>
             </w:r>
           </w:p>
         </w:tc>
@@ -3022,7 +3739,7 @@
         </w:tc>
         <w:tc>
           <w:tcPr>
-            <w:tcW w:type="dxa" w:w="3744"/>
+            <w:tcW w:type="dxa" w:w="4032"/>
             <w:shd w:val="clear" w:color="auto" w:fill="EEF3FA"/>
           </w:tcPr>
           <w:p>
@@ -3039,7 +3756,7 @@
         </w:tc>
         <w:tc>
           <w:tcPr>
-            <w:tcW w:type="dxa" w:w="3168"/>
+            <w:tcW w:type="dxa" w:w="2880"/>
             <w:shd w:val="clear" w:color="auto" w:fill="EEF3FA"/>
           </w:tcPr>
           <w:p>
@@ -3050,7 +3767,7 @@
               <w:rPr>
                 <w:sz w:val="18"/>
               </w:rPr>
-              <w:t>2 indicator columns</w:t>
+              <w:t>2</w:t>
             </w:r>
           </w:p>
         </w:tc>
@@ -3075,7 +3792,7 @@
         </w:tc>
         <w:tc>
           <w:tcPr>
-            <w:tcW w:type="dxa" w:w="3744"/>
+            <w:tcW w:type="dxa" w:w="4032"/>
             <w:shd w:val="clear" w:color="auto" w:fill="FFFFFF"/>
           </w:tcPr>
           <w:p>
@@ -3092,7 +3809,7 @@
         </w:tc>
         <w:tc>
           <w:tcPr>
-            <w:tcW w:type="dxa" w:w="3168"/>
+            <w:tcW w:type="dxa" w:w="2880"/>
             <w:shd w:val="clear" w:color="auto" w:fill="FFFFFF"/>
           </w:tcPr>
           <w:p>
@@ -3103,7 +3820,60 @@
               <w:rPr>
                 <w:sz w:val="18"/>
               </w:rPr>
-              <w:t>3 indicator columns</w:t>
+              <w:t>3</w:t>
+            </w:r>
+          </w:p>
+        </w:tc>
+      </w:tr>
+      <w:tr>
+        <w:tc>
+          <w:tcPr>
+            <w:tcW w:type="dxa" w:w="2304"/>
+            <w:shd w:val="clear" w:color="auto" w:fill="EEF3FA"/>
+          </w:tcPr>
+          <w:p>
+            <w:pPr>
+              <w:jc w:val="center"/>
+            </w:pPr>
+            <w:r>
+              <w:rPr>
+                <w:sz w:val="18"/>
+              </w:rPr>
+              <w:t>TOTAL</w:t>
+            </w:r>
+          </w:p>
+        </w:tc>
+        <w:tc>
+          <w:tcPr>
+            <w:tcW w:type="dxa" w:w="4032"/>
+            <w:shd w:val="clear" w:color="auto" w:fill="EEF3FA"/>
+          </w:tcPr>
+          <w:p>
+            <w:pPr>
+              <w:jc w:val="center"/>
+            </w:pPr>
+            <w:r>
+              <w:rPr>
+                <w:sz w:val="18"/>
+              </w:rPr>
+              <w:t>—</w:t>
+            </w:r>
+          </w:p>
+        </w:tc>
+        <w:tc>
+          <w:tcPr>
+            <w:tcW w:type="dxa" w:w="2880"/>
+            <w:shd w:val="clear" w:color="auto" w:fill="EEF3FA"/>
+          </w:tcPr>
+          <w:p>
+            <w:pPr>
+              <w:jc w:val="center"/>
+            </w:pPr>
+            <w:r>
+              <w:rPr>
+                <w:sz w:val="18"/>
+              </w:rPr>
+              <w:t>13 new columns</w:t>
             </w:r>
           </w:p>
         </w:tc>
@@ -3116,7 +3886,7 @@
           <w:color w:val="1C1C2E"/>
           <w:sz w:val="20"/>
         </w:rPr>
-        <w:t>Final processed dataset contains 23 columns after encoding (vs. 16 before).</w:t>
+        <w:t>Final processed dataset: 23 columns (16 after feature selection → +13 OHE columns → 23 total).</w:t>
       </w:r>
     </w:p>
     <w:p/>
@@ -3138,7 +3908,7 @@
           <w:color w:val="1C1C2E"/>
           <w:sz w:val="20"/>
         </w:rPr>
-        <w:t>StandardScaler (Z-score normalisation) is applied to the three continuous numerical features: TenureMonths, MonthlyCharges, and TotalCharges. StandardScaler transforms each feature to zero mean and unit variance, ensuring no single feature dominates distance-based algorithms.</w:t>
+        <w:t>StandardScaler (Z-score normalisation) is applied exclusively to the three continuous numerical features: TenureMonths, MonthlyCharges, and TotalCharges. StandardScaler transforms each feature to zero mean and unit variance.</w:t>
       </w:r>
     </w:p>
     <w:p/>
@@ -3148,7 +3918,7 @@
           <w:color w:val="1C1C2E"/>
           <w:sz w:val="20"/>
         </w:rPr>
-        <w:t>Formula: z = (x − μ) / σ   where μ = column mean, σ = column standard deviation</w:t>
+        <w:t>Formula:  z = (x − μ) / σ   where μ = column mean, σ = column standard deviation</w:t>
       </w:r>
     </w:p>
     <w:p/>
@@ -3274,7 +4044,7 @@
               <w:rPr>
                 <w:sz w:val="18"/>
               </w:rPr>
-              <w:t>1 – 72 (months)</w:t>
+              <w:t>1 – 72 months</w:t>
             </w:r>
           </w:p>
         </w:tc>
@@ -3414,7 +4184,7 @@
               <w:rPr>
                 <w:sz w:val="18"/>
               </w:rPr>
-              <w:t>$18.00 – ~$8,400+</w:t>
+              <w:t>$18.00 – ~$8,264</w:t>
             </w:r>
           </w:p>
         </w:tc>
@@ -3461,7 +4231,7 @@
           <w:color w:val="1C1C2E"/>
           <w:sz w:val="20"/>
         </w:rPr>
-        <w:t>All three scaled features now have approximately zero mean and unit standard deviation, confirming successful StandardScaler application. Binary and one-hot encoded columns are already in the [0, 1] range and do not require scaling.</w:t>
+        <w:t>All three features now have mean ≈ 0 and std ≈ 1, confirming correct StandardScaler application. Binary-encoded and one-hot-encoded columns are already in the [0, 1] range and are not scaled.</w:t>
       </w:r>
     </w:p>
     <w:p>
@@ -3513,7 +4283,7 @@
           <w:color w:val="555555"/>
           <w:sz w:val="18"/>
         </w:rPr>
-        <w:t>Figure 3. Distribution of MonthlyCharges before (left, $) and after (right) StandardScaler normalisation. Post-scaling values are centred at 0 with unit variance.</w:t>
+        <w:t>Figure 3. MonthlyCharges distribution before (left, raw $) and after (right) StandardScaler normalisation. Post-scaling values are centred at mean=0 with unit standard deviation.</w:t>
       </w:r>
     </w:p>
     <w:p/>
@@ -3535,7 +4305,7 @@
           <w:color w:val="1C1C2E"/>
           <w:sz w:val="20"/>
         </w:rPr>
-        <w:t>Exploratory data analysis is performed on both the raw and processed datasets to uncover distributional patterns, class balance, feature relationships, and the impact of preprocessing.</w:t>
+        <w:t>Exploratory analysis is performed on both raw and processed datasets to uncover distributional patterns, class balance, feature relationships, and the impact of preprocessing.</w:t>
       </w:r>
     </w:p>
     <w:p>
@@ -3606,7 +4376,7 @@
                 <w:color w:val="FFFFFF"/>
                 <w:sz w:val="18"/>
               </w:rPr>
-              <w:t>Count</w:t>
+              <w:t>Count (Raw)</w:t>
             </w:r>
           </w:p>
         </w:tc>
@@ -3625,7 +4395,7 @@
                 <w:color w:val="FFFFFF"/>
                 <w:sz w:val="18"/>
               </w:rPr>
-              <w:t>Percentage</w:t>
+              <w:t>Percentage (Raw)</w:t>
             </w:r>
           </w:p>
         </w:tc>
@@ -3797,7 +4567,7 @@
           <w:color w:val="1C1C2E"/>
           <w:sz w:val="20"/>
         </w:rPr>
-        <w:t>After preprocessing (deduplication removes 10 rows), the processed dataset (1,200 rows) shows: Non-Churned = 761 (63.42%), Churned = 439 (36.58%). The dataset has a moderate class imbalance (~63:37) which should be addressed during model training using techniques such as class weighting or SMOTE oversampling.</w:t>
+        <w:t>After preprocessing (removing 10 duplicate rows), the processed dataset (1,200 rows) shows: Non-Churned = 761 (63.42%), Churned = 439 (36.58%). The dataset has a moderate class imbalance (~63:37) which should be addressed during model training using techniques such as class weighting or SMOTE oversampling.</w:t>
       </w:r>
     </w:p>
     <w:p/>
@@ -3850,7 +4620,7 @@
           <w:color w:val="555555"/>
           <w:sz w:val="18"/>
         </w:rPr>
-        <w:t>Figure 1. Customer churn class distribution in the raw dataset. Left: bar chart showing No=766, Yes=444. Right: pie chart showing 63.3% non-churned vs 36.7% churned.</w:t>
+        <w:t>Figure 1. Customer churn class distribution in the raw dataset (1,210 rows). Left: bar chart showing Non-Churned=766, Churned=444. Right: pie chart showing 63.3% non-churned vs 36.7% churned.</w:t>
       </w:r>
     </w:p>
     <w:p/>
@@ -3872,7 +4642,7 @@
           <w:color w:val="1C1C2E"/>
           <w:sz w:val="20"/>
         </w:rPr>
-        <w:t>Month-to-month contract customers exhibit significantly higher churn rates compared to one-year and two-year contract customers. This aligns with the dataset generation logic where month-to-month contracts carry a +0.25 churn probability boost, while two-year contracts carry a −0.18 reduction.</w:t>
+        <w:t>Month-to-month contract customers exhibit significantly higher churn rates compared to one-year and two-year contract customers. This aligns with the dataset generation logic where month-to-month contracts carry a +0.25 churn probability boost.</w:t>
       </w:r>
     </w:p>
     <w:p>
@@ -4020,7 +4790,7 @@
           <w:color w:val="1C1C2E"/>
           <w:sz w:val="20"/>
         </w:rPr>
-        <w:t>A correlation heatmap of the top 12 features most correlated with the Churn target reveals expected positive correlations with month-to-month contract and fibre optic service, and negative correlations with long tenure and two-year contracts.</w:t>
+        <w:t>A correlation heatmap of the top 12 features most correlated with the Churn target reveals positive correlations with month-to-month contract and fibre optic service, and negative correlations with long tenure and two-year contracts.</w:t>
       </w:r>
     </w:p>
     <w:p>
@@ -4072,7 +4842,7 @@
           <w:color w:val="555555"/>
           <w:sz w:val="18"/>
         </w:rPr>
-        <w:t>Figure 6. Correlation heatmap of processed features vs. Churn target. Warmer colours indicate stronger positive correlation; cooler colours indicate negative correlation.</w:t>
+        <w:t>Figure 6. Correlation heatmap of processed features vs. Churn. Warmer colours = stronger positive correlation; cooler colours = negative correlation.</w:t>
       </w:r>
     </w:p>
     <w:p/>
@@ -4094,7 +4864,7 @@
           <w:color w:val="1C1C2E"/>
           <w:sz w:val="20"/>
         </w:rPr>
-        <w:t>The table below summarises the state of the dataset at each preprocessing stage, providing a before-vs-after comparison of key quality metrics.</w:t>
+        <w:t>The table below summarises key quality metrics before and after preprocessing:</w:t>
       </w:r>
     </w:p>
     <w:p/>
@@ -4113,7 +4883,7 @@
       <w:tr>
         <w:tc>
           <w:tcPr>
-            <w:tcW w:type="dxa" w:w="3456"/>
+            <w:tcW w:type="dxa" w:w="3600"/>
             <w:shd w:val="clear" w:color="auto" w:fill="1A355E"/>
           </w:tcPr>
           <w:p>
@@ -4132,7 +4902,7 @@
         </w:tc>
         <w:tc>
           <w:tcPr>
-            <w:tcW w:type="dxa" w:w="3024"/>
+            <w:tcW w:type="dxa" w:w="2880"/>
             <w:shd w:val="clear" w:color="auto" w:fill="1A355E"/>
           </w:tcPr>
           <w:p>
@@ -4172,7 +4942,7 @@
       <w:tr>
         <w:tc>
           <w:tcPr>
-            <w:tcW w:type="dxa" w:w="3456"/>
+            <w:tcW w:type="dxa" w:w="3600"/>
             <w:shd w:val="clear" w:color="auto" w:fill="EEF3FA"/>
           </w:tcPr>
           <w:p>
@@ -4189,7 +4959,7 @@
         </w:tc>
         <w:tc>
           <w:tcPr>
-            <w:tcW w:type="dxa" w:w="3024"/>
+            <w:tcW w:type="dxa" w:w="2880"/>
             <w:shd w:val="clear" w:color="auto" w:fill="EEF3FA"/>
           </w:tcPr>
           <w:p>
@@ -4225,7 +4995,7 @@
       <w:tr>
         <w:tc>
           <w:tcPr>
-            <w:tcW w:type="dxa" w:w="3456"/>
+            <w:tcW w:type="dxa" w:w="3600"/>
             <w:shd w:val="clear" w:color="auto" w:fill="FFFFFF"/>
           </w:tcPr>
           <w:p>
@@ -4242,7 +5012,7 @@
         </w:tc>
         <w:tc>
           <w:tcPr>
-            <w:tcW w:type="dxa" w:w="3024"/>
+            <w:tcW w:type="dxa" w:w="2880"/>
             <w:shd w:val="clear" w:color="auto" w:fill="FFFFFF"/>
           </w:tcPr>
           <w:p>
@@ -4278,7 +5048,7 @@
       <w:tr>
         <w:tc>
           <w:tcPr>
-            <w:tcW w:type="dxa" w:w="3456"/>
+            <w:tcW w:type="dxa" w:w="3600"/>
             <w:shd w:val="clear" w:color="auto" w:fill="EEF3FA"/>
           </w:tcPr>
           <w:p>
@@ -4289,13 +5059,13 @@
               <w:rPr>
                 <w:sz w:val="18"/>
               </w:rPr>
-              <w:t>Missing Values</w:t>
+              <w:t>Explicit NaN values</w:t>
             </w:r>
           </w:p>
         </w:tc>
         <w:tc>
           <w:tcPr>
-            <w:tcW w:type="dxa" w:w="3024"/>
+            <w:tcW w:type="dxa" w:w="2880"/>
             <w:shd w:val="clear" w:color="auto" w:fill="EEF3FA"/>
           </w:tcPr>
           <w:p>
@@ -4331,7 +5101,7 @@
       <w:tr>
         <w:tc>
           <w:tcPr>
-            <w:tcW w:type="dxa" w:w="3456"/>
+            <w:tcW w:type="dxa" w:w="3600"/>
             <w:shd w:val="clear" w:color="auto" w:fill="FFFFFF"/>
           </w:tcPr>
           <w:p>
@@ -4342,7 +5112,24 @@
               <w:rPr>
                 <w:sz w:val="18"/>
               </w:rPr>
-              <w:t>Duplicate Rows</w:t>
+              <w:t>Blank TotalCharges strings</w:t>
+            </w:r>
+          </w:p>
+        </w:tc>
+        <w:tc>
+          <w:tcPr>
+            <w:tcW w:type="dxa" w:w="2880"/>
+            <w:shd w:val="clear" w:color="auto" w:fill="FFFFFF"/>
+          </w:tcPr>
+          <w:p>
+            <w:pPr>
+              <w:jc w:val="center"/>
+            </w:pPr>
+            <w:r>
+              <w:rPr>
+                <w:sz w:val="18"/>
+              </w:rPr>
+              <w:t>25</w:t>
             </w:r>
           </w:p>
         </w:tc>
@@ -4359,7 +5146,96 @@
               <w:rPr>
                 <w:sz w:val="18"/>
               </w:rPr>
-              <w:t>10</w:t>
+              <w:t>0 (coerced → imputed)</w:t>
+            </w:r>
+          </w:p>
+        </w:tc>
+      </w:tr>
+      <w:tr>
+        <w:tc>
+          <w:tcPr>
+            <w:tcW w:type="dxa" w:w="3600"/>
+            <w:shd w:val="clear" w:color="auto" w:fill="EEF3FA"/>
+          </w:tcPr>
+          <w:p>
+            <w:pPr>
+              <w:jc w:val="center"/>
+            </w:pPr>
+            <w:r>
+              <w:rPr>
+                <w:sz w:val="18"/>
+              </w:rPr>
+              <w:t>Invalid negatives → NaN</w:t>
+            </w:r>
+          </w:p>
+        </w:tc>
+        <w:tc>
+          <w:tcPr>
+            <w:tcW w:type="dxa" w:w="2880"/>
+            <w:shd w:val="clear" w:color="auto" w:fill="EEF3FA"/>
+          </w:tcPr>
+          <w:p>
+            <w:pPr>
+              <w:jc w:val="center"/>
+            </w:pPr>
+            <w:r>
+              <w:rPr>
+                <w:sz w:val="18"/>
+              </w:rPr>
+              <w:t>2</w:t>
+            </w:r>
+          </w:p>
+        </w:tc>
+        <w:tc>
+          <w:tcPr>
+            <w:tcW w:type="dxa" w:w="3024"/>
+            <w:shd w:val="clear" w:color="auto" w:fill="EEF3FA"/>
+          </w:tcPr>
+          <w:p>
+            <w:pPr>
+              <w:jc w:val="center"/>
+            </w:pPr>
+            <w:r>
+              <w:rPr>
+                <w:sz w:val="18"/>
+              </w:rPr>
+              <w:t>0 (imputed)</w:t>
+            </w:r>
+          </w:p>
+        </w:tc>
+      </w:tr>
+      <w:tr>
+        <w:tc>
+          <w:tcPr>
+            <w:tcW w:type="dxa" w:w="3600"/>
+            <w:shd w:val="clear" w:color="auto" w:fill="FFFFFF"/>
+          </w:tcPr>
+          <w:p>
+            <w:pPr>
+              <w:jc w:val="center"/>
+            </w:pPr>
+            <w:r>
+              <w:rPr>
+                <w:sz w:val="18"/>
+              </w:rPr>
+              <w:t>Total missing-like cells handled</w:t>
+            </w:r>
+          </w:p>
+        </w:tc>
+        <w:tc>
+          <w:tcPr>
+            <w:tcW w:type="dxa" w:w="2880"/>
+            <w:shd w:val="clear" w:color="auto" w:fill="FFFFFF"/>
+          </w:tcPr>
+          <w:p>
+            <w:pPr>
+              <w:jc w:val="center"/>
+            </w:pPr>
+            <w:r>
+              <w:rPr>
+                <w:sz w:val="18"/>
+              </w:rPr>
+              <w:t>120</w:t>
             </w:r>
           </w:p>
         </w:tc>
@@ -4384,7 +5260,113 @@
       <w:tr>
         <w:tc>
           <w:tcPr>
-            <w:tcW w:type="dxa" w:w="3456"/>
+            <w:tcW w:type="dxa" w:w="3600"/>
+            <w:shd w:val="clear" w:color="auto" w:fill="EEF3FA"/>
+          </w:tcPr>
+          <w:p>
+            <w:pPr>
+              <w:jc w:val="center"/>
+            </w:pPr>
+            <w:r>
+              <w:rPr>
+                <w:sz w:val="18"/>
+              </w:rPr>
+              <w:t>Duplicate Rows</w:t>
+            </w:r>
+          </w:p>
+        </w:tc>
+        <w:tc>
+          <w:tcPr>
+            <w:tcW w:type="dxa" w:w="2880"/>
+            <w:shd w:val="clear" w:color="auto" w:fill="EEF3FA"/>
+          </w:tcPr>
+          <w:p>
+            <w:pPr>
+              <w:jc w:val="center"/>
+            </w:pPr>
+            <w:r>
+              <w:rPr>
+                <w:sz w:val="18"/>
+              </w:rPr>
+              <w:t>10</w:t>
+            </w:r>
+          </w:p>
+        </w:tc>
+        <w:tc>
+          <w:tcPr>
+            <w:tcW w:type="dxa" w:w="3024"/>
+            <w:shd w:val="clear" w:color="auto" w:fill="EEF3FA"/>
+          </w:tcPr>
+          <w:p>
+            <w:pPr>
+              <w:jc w:val="center"/>
+            </w:pPr>
+            <w:r>
+              <w:rPr>
+                <w:sz w:val="18"/>
+              </w:rPr>
+              <w:t>0</w:t>
+            </w:r>
+          </w:p>
+        </w:tc>
+      </w:tr>
+      <w:tr>
+        <w:tc>
+          <w:tcPr>
+            <w:tcW w:type="dxa" w:w="3600"/>
+            <w:shd w:val="clear" w:color="auto" w:fill="FFFFFF"/>
+          </w:tcPr>
+          <w:p>
+            <w:pPr>
+              <w:jc w:val="center"/>
+            </w:pPr>
+            <w:r>
+              <w:rPr>
+                <w:sz w:val="18"/>
+              </w:rPr>
+              <w:t>Values IQR-capped</w:t>
+            </w:r>
+          </w:p>
+        </w:tc>
+        <w:tc>
+          <w:tcPr>
+            <w:tcW w:type="dxa" w:w="2880"/>
+            <w:shd w:val="clear" w:color="auto" w:fill="FFFFFF"/>
+          </w:tcPr>
+          <w:p>
+            <w:pPr>
+              <w:jc w:val="center"/>
+            </w:pPr>
+            <w:r>
+              <w:rPr>
+                <w:sz w:val="18"/>
+              </w:rPr>
+              <w:t>3 (MC: 2, TN: 1, TC: 0)</w:t>
+            </w:r>
+          </w:p>
+        </w:tc>
+        <w:tc>
+          <w:tcPr>
+            <w:tcW w:type="dxa" w:w="3024"/>
+            <w:shd w:val="clear" w:color="auto" w:fill="FFFFFF"/>
+          </w:tcPr>
+          <w:p>
+            <w:pPr>
+              <w:jc w:val="center"/>
+            </w:pPr>
+            <w:r>
+              <w:rPr>
+                <w:sz w:val="18"/>
+              </w:rPr>
+              <w:t>0 (all within bounds)</w:t>
+            </w:r>
+          </w:p>
+        </w:tc>
+      </w:tr>
+      <w:tr>
+        <w:tc>
+          <w:tcPr>
+            <w:tcW w:type="dxa" w:w="3600"/>
             <w:shd w:val="clear" w:color="auto" w:fill="EEF3FA"/>
           </w:tcPr>
           <w:p>
@@ -4401,7 +5383,7 @@
         </w:tc>
         <w:tc>
           <w:tcPr>
-            <w:tcW w:type="dxa" w:w="3024"/>
+            <w:tcW w:type="dxa" w:w="2880"/>
             <w:shd w:val="clear" w:color="auto" w:fill="EEF3FA"/>
           </w:tcPr>
           <w:p>
@@ -4412,7 +5394,7 @@
               <w:rPr>
                 <w:sz w:val="18"/>
               </w:rPr>
-              <w:t>15 total object columns</w:t>
+              <w:t>15 total</w:t>
               <w:br/>
               <w:t>(13 predictors + CustomerID + Churn)</w:t>
             </w:r>
@@ -4439,7 +5421,7 @@
       <w:tr>
         <w:tc>
           <w:tcPr>
-            <w:tcW w:type="dxa" w:w="3456"/>
+            <w:tcW w:type="dxa" w:w="3600"/>
             <w:shd w:val="clear" w:color="auto" w:fill="FFFFFF"/>
           </w:tcPr>
           <w:p>
@@ -4456,7 +5438,7 @@
         </w:tc>
         <w:tc>
           <w:tcPr>
-            <w:tcW w:type="dxa" w:w="3024"/>
+            <w:tcW w:type="dxa" w:w="2880"/>
             <w:shd w:val="clear" w:color="auto" w:fill="FFFFFF"/>
           </w:tcPr>
           <w:p>
@@ -4492,7 +5474,7 @@
       <w:tr>
         <w:tc>
           <w:tcPr>
-            <w:tcW w:type="dxa" w:w="3456"/>
+            <w:tcW w:type="dxa" w:w="3600"/>
             <w:shd w:val="clear" w:color="auto" w:fill="EEF3FA"/>
           </w:tcPr>
           <w:p>
@@ -4509,7 +5491,7 @@
         </w:tc>
         <w:tc>
           <w:tcPr>
-            <w:tcW w:type="dxa" w:w="3024"/>
+            <w:tcW w:type="dxa" w:w="2880"/>
             <w:shd w:val="clear" w:color="auto" w:fill="EEF3FA"/>
           </w:tcPr>
           <w:p>
@@ -4545,61 +5527,8 @@
       <w:tr>
         <w:tc>
           <w:tcPr>
-            <w:tcW w:type="dxa" w:w="3456"/>
+            <w:tcW w:type="dxa" w:w="3600"/>
             <w:shd w:val="clear" w:color="auto" w:fill="FFFFFF"/>
-          </w:tcPr>
-          <w:p>
-            <w:pPr>
-              <w:jc w:val="center"/>
-            </w:pPr>
-            <w:r>
-              <w:rPr>
-                <w:sz w:val="18"/>
-              </w:rPr>
-              <w:t>Memory Usage</w:t>
-            </w:r>
-          </w:p>
-        </w:tc>
-        <w:tc>
-          <w:tcPr>
-            <w:tcW w:type="dxa" w:w="3024"/>
-            <w:shd w:val="clear" w:color="auto" w:fill="FFFFFF"/>
-          </w:tcPr>
-          <w:p>
-            <w:pPr>
-              <w:jc w:val="center"/>
-            </w:pPr>
-            <w:r>
-              <w:rPr>
-                <w:sz w:val="18"/>
-              </w:rPr>
-              <w:t>~1.12 MB</w:t>
-            </w:r>
-          </w:p>
-        </w:tc>
-        <w:tc>
-          <w:tcPr>
-            <w:tcW w:type="dxa" w:w="3024"/>
-            <w:shd w:val="clear" w:color="auto" w:fill="FFFFFF"/>
-          </w:tcPr>
-          <w:p>
-            <w:pPr>
-              <w:jc w:val="center"/>
-            </w:pPr>
-            <w:r>
-              <w:rPr>
-                <w:sz w:val="18"/>
-              </w:rPr>
-              <w:t>~0.21 MB (~81.1% reduction)</w:t>
-            </w:r>
-          </w:p>
-        </w:tc>
-      </w:tr>
-      <w:tr>
-        <w:tc>
-          <w:tcPr>
-            <w:tcW w:type="dxa" w:w="3456"/>
-            <w:shd w:val="clear" w:color="auto" w:fill="EEF3FA"/>
           </w:tcPr>
           <w:p>
             <w:pPr>
@@ -4615,8 +5544,8 @@
         </w:tc>
         <w:tc>
           <w:tcPr>
-            <w:tcW w:type="dxa" w:w="3024"/>
-            <w:shd w:val="clear" w:color="auto" w:fill="EEF3FA"/>
+            <w:tcW w:type="dxa" w:w="2880"/>
+            <w:shd w:val="clear" w:color="auto" w:fill="FFFFFF"/>
           </w:tcPr>
           <w:p>
             <w:pPr>
@@ -4633,7 +5562,7 @@
         <w:tc>
           <w:tcPr>
             <w:tcW w:type="dxa" w:w="3024"/>
-            <w:shd w:val="clear" w:color="auto" w:fill="EEF3FA"/>
+            <w:shd w:val="clear" w:color="auto" w:fill="FFFFFF"/>
           </w:tcPr>
           <w:p>
             <w:pPr>
@@ -4651,8 +5580,8 @@
       <w:tr>
         <w:tc>
           <w:tcPr>
-            <w:tcW w:type="dxa" w:w="3456"/>
-            <w:shd w:val="clear" w:color="auto" w:fill="FFFFFF"/>
+            <w:tcW w:type="dxa" w:w="3600"/>
+            <w:shd w:val="clear" w:color="auto" w:fill="EEF3FA"/>
           </w:tcPr>
           <w:p>
             <w:pPr>
@@ -4662,14 +5591,14 @@
               <w:rPr>
                 <w:sz w:val="18"/>
               </w:rPr>
-              <w:t>Outliers (total capped)</w:t>
+              <w:t>Memory Usage</w:t>
             </w:r>
           </w:p>
         </w:tc>
         <w:tc>
           <w:tcPr>
-            <w:tcW w:type="dxa" w:w="3024"/>
-            <w:shd w:val="clear" w:color="auto" w:fill="FFFFFF"/>
+            <w:tcW w:type="dxa" w:w="2880"/>
+            <w:shd w:val="clear" w:color="auto" w:fill="EEF3FA"/>
           </w:tcPr>
           <w:p>
             <w:pPr>
@@ -4679,14 +5608,14 @@
               <w:rPr>
                 <w:sz w:val="18"/>
               </w:rPr>
-              <w:t>4 (via IQR-based capping)</w:t>
+              <w:t>~1.12 MB</w:t>
             </w:r>
           </w:p>
         </w:tc>
         <w:tc>
           <w:tcPr>
             <w:tcW w:type="dxa" w:w="3024"/>
-            <w:shd w:val="clear" w:color="auto" w:fill="FFFFFF"/>
+            <w:shd w:val="clear" w:color="auto" w:fill="EEF3FA"/>
           </w:tcPr>
           <w:p>
             <w:pPr>
@@ -4696,7 +5625,7 @@
               <w:rPr>
                 <w:sz w:val="18"/>
               </w:rPr>
-              <w:t>0</w:t>
+              <w:t>~0.21 MB (~81.1% reduction)</w:t>
             </w:r>
           </w:p>
         </w:tc>
@@ -4709,7 +5638,7 @@
           <w:color w:val="1C1C2E"/>
           <w:sz w:val="20"/>
         </w:rPr>
-        <w:t>After completing all seven preprocessing stages, the processed dataset is suitable as a preprocessed input for downstream machine learning tasks. All features are numeric, missing values have been imputed, outliers capped, and continuous features normalised. The dataset can be split into train/test sets and fed directly into scikit-learn estimators such as LogisticRegression, RandomForestClassifier, or XGBClassifier.</w:t>
+        <w:t>After completing all preprocessing stages, the processed dataset is suitable as a preprocessed input for downstream machine learning tasks. All features are numeric, missing cells have been imputed, outliers capped or corrected, and continuous features normalised. The dataset can be split into train/test sets and fed directly into scikit-learn estimators such as LogisticRegression, RandomForestClassifier, or XGBClassifier.</w:t>
       </w:r>
     </w:p>
     <w:p/>
@@ -4744,7 +5673,7 @@
           <w:color w:val="1C1C2E"/>
           <w:sz w:val="20"/>
         </w:rPr>
-        <w:t>src/generate_dataset.py — A synthetic dataset of 1,200 base records is generated with np.random.seed(42), then 10 duplicate rows are appended producing 1,210 raw rows. Intentional flaws (NaNs, blank strings, outliers, inconsistent categories) are injected to simulate real-world data quality issues.</w:t>
+        <w:t>src/generate_dataset.py — A synthetic dataset of 1,200 base records is generated with np.random.seed(42). Ten duplicate rows are appended, producing 1,210 raw rows. Intentional flaws (93 NaN, 25 blank TotalCharges strings, 2 negative values, outliers, inconsistent categories) are injected to simulate real-world data quality issues.</w:t>
       </w:r>
     </w:p>
     <w:p/>
@@ -4767,7 +5696,7 @@
           <w:color w:val="1C1C2E"/>
           <w:sz w:val="20"/>
         </w:rPr>
-        <w:t>ChurnDataPreprocessor.load_data() — pd.read_csv() loads the raw CSV. Shape and dtypes are verified immediately.</w:t>
+        <w:t>ChurnDataPreprocessor.load_data() — pd.read_csv() loads the raw CSV from data/raw/customer_churn_raw.csv. Shape (1210, 19) and dtypes are verified immediately.</w:t>
       </w:r>
     </w:p>
     <w:p/>
@@ -4778,7 +5707,7 @@
           <w:color w:val="2B5C8F"/>
           <w:sz w:val="20"/>
         </w:rPr>
-        <w:t>Step 3: Formatting &amp; Type Correction</w:t>
+        <w:t>Step 3: Formatting &amp; Invalid Value Correction</w:t>
       </w:r>
     </w:p>
     <w:p>
@@ -4790,7 +5719,7 @@
           <w:color w:val="1C1C2E"/>
           <w:sz w:val="20"/>
         </w:rPr>
-        <w:t>clean_initial_formatting() — TotalCharges blank strings are stripped and pd.to_numeric(..., errors='coerce') converts them to NaN/float64. Negative MonthlyCharges and TenureMonths are set to NaN (physically impossible values).</w:t>
+        <w:t>clean_initial_formatting() — (a) TotalCharges blank strings are stripped and pd.to_numeric(..., errors='coerce') converts 25 cells to NaN, then casts column to float64. (b) MonthlyCharges=−150.0 set to NaN (physically impossible). (c) TenureMonths=−12.0 set to NaN (physically impossible). These 2 invalid values are NOT IQR-capped — they are treated as data entry errors and subsequently imputed in Step 6.</w:t>
       </w:r>
     </w:p>
     <w:p/>
@@ -4813,7 +5742,7 @@
           <w:color w:val="1C1C2E"/>
           <w:sz w:val="20"/>
         </w:rPr>
-        <w:t>remove_duplicates() — drop_duplicates(subset=['CustomerID']) removes 10 duplicate records. Row count: 1,210 → 1,200.</w:t>
+        <w:t>remove_duplicates() — drop_duplicates(subset=['CustomerID'], keep='first') removes 10 duplicate records. Row count: 1210 → 1200.</w:t>
       </w:r>
     </w:p>
     <w:p/>
@@ -4836,7 +5765,7 @@
           <w:color w:val="1C1C2E"/>
           <w:sz w:val="20"/>
         </w:rPr>
-        <w:t>standardize_categorical_values() — A dictionary map normalises Gender variants ('female', 'F', 'male', 'M') to canonical 'Female' / 'Male'.</w:t>
+        <w:t>standardize_categorical_values() — A dictionary map normalises Gender variants ('female', 'F', 'male', 'M') to canonical 'Female' / 'Male' before encoding.</w:t>
       </w:r>
     </w:p>
     <w:p/>
@@ -4859,7 +5788,7 @@
           <w:color w:val="1C1C2E"/>
           <w:sz w:val="20"/>
         </w:rPr>
-        <w:t>handle_missing_values() — 93 missing values imputed: numerical columns (SeniorCitizen, TenureMonths, MonthlyCharges, TotalCharges) via median; categorical columns (Gender, PaymentMethod) via mode.</w:t>
+        <w:t>handle_missing_values() — 120 missing or invalid cells are imputed: • 93 explicit NaN + 25 blank TotalCharges + 2 negative→NaN = 120 total. Numerical columns (SeniorCitizen, TenureMonths, MonthlyCharges, TotalCharges) use median imputation (robust against skewed values). Categorical columns (Gender, PaymentMethod) use mode imputation.</w:t>
       </w:r>
     </w:p>
     <w:p/>
@@ -4870,7 +5799,7 @@
           <w:color w:val="2B5C8F"/>
           <w:sz w:val="20"/>
         </w:rPr>
-        <w:t>Step 7: Outlier Treatment</w:t>
+        <w:t>Step 7: Outlier Detection &amp; Treatment (IQR-Based Capping)</w:t>
       </w:r>
     </w:p>
     <w:p>
@@ -4882,7 +5811,7 @@
           <w:color w:val="1C1C2E"/>
           <w:sz w:val="20"/>
         </w:rPr>
-        <w:t>detect_and_cap_outliers() via compute_iqr_outliers() in utils.py — IQR-based capping applied to MonthlyCharges (3 outliers, bounds [$4.89, $147.91]) and TenureMonths (1 outlier, bounds [-34.12m, 106.88m]). TotalCharges had 0 outliers beyond IQR bounds.</w:t>
+        <w:t>detect_and_cap_outliers() via utils.compute_iqr_outliers() — IQR-based capping applied to MonthlyCharges (2 values capped: 9,999 and 4,500 → upper bound $147.12; bounds [$5.57, $147.12]) and TenureMonths (1 value capped: 350 → 106.5m; bounds [-33.5m, 106.5m]). TotalCharges had 0 values outside IQR bounds. Total IQR-capped: 3 values. Note: The 2 negative values (−150 and −12) were already corrected in Step 3 and are NOT counted here.</w:t>
       </w:r>
     </w:p>
     <w:p/>
@@ -4905,7 +5834,7 @@
           <w:color w:val="1C1C2E"/>
           <w:sz w:val="20"/>
         </w:rPr>
-        <w:t>perform_feature_selection() — 3 non-predictive columns dropped: CustomerID (primary key), SystemLogCode (arbitrary internal code), RandomNoiseScore (random noise).</w:t>
+        <w:t>perform_feature_selection() — 3 non-predictive columns dropped: CustomerID (primary key with no predictive signal), SystemLogCode (arbitrary internal code), RandomNoiseScore (explicitly random noise feature).</w:t>
       </w:r>
     </w:p>
     <w:p/>
@@ -4916,7 +5845,7 @@
           <w:color w:val="2B5C8F"/>
           <w:sz w:val="20"/>
         </w:rPr>
-        <w:t>Step 9: Categorical Encoding</w:t>
+        <w:t>Step 9: Categorical Variable Encoding</w:t>
       </w:r>
     </w:p>
     <w:p>
@@ -4928,7 +5857,7 @@
           <w:color w:val="1C1C2E"/>
           <w:sz w:val="20"/>
         </w:rPr>
-        <w:t>encode_categorical_variables() — 6 binary columns mapped to 0/1 integers. 6 multi-category columns one-hot encoded via pd.get_dummies(drop_first=True) producing 13 new indicator columns. Churn target encoded: No → 0, Yes → 1.</w:t>
+        <w:t>encode_categorical_variables() — 6 binary columns mapped to 0/1 integers (Gender, SeniorCitizen, Partner, Dependents, PhoneService, PaperlessBilling). Churn target encoded: No→0, Yes→1. 6 multi-category columns one-hot encoded via pd.get_dummies(drop_first=True) producing 13 new indicator columns. Final column count: 23.</w:t>
       </w:r>
     </w:p>
     <w:p/>
@@ -4939,7 +5868,7 @@
           <w:color w:val="2B5C8F"/>
           <w:sz w:val="20"/>
         </w:rPr>
-        <w:t>Step 10: Feature Scaling</w:t>
+        <w:t>Step 10: Feature Scaling (StandardScaler)</w:t>
       </w:r>
     </w:p>
     <w:p>
@@ -4951,7 +5880,7 @@
           <w:color w:val="1C1C2E"/>
           <w:sz w:val="20"/>
         </w:rPr>
-        <w:t>scale_numerical_features() — StandardScaler applied to TenureMonths, MonthlyCharges, TotalCharges. All three columns transformed to mean ≈ 0, std ≈ 1. Binary and one-hot encoded columns are not scaled (already in [0, 1] range).</w:t>
+        <w:t>scale_numerical_features() — StandardScaler applied exclusively to TenureMonths, MonthlyCharges, and TotalCharges (the 3 continuous numerical features). All three columns transformed to mean ≈ 0, std ≈ 1. Binary and one-hot encoded columns are not scaled (already in the [0, 1] range).</w:t>
       </w:r>
     </w:p>
     <w:p/>
@@ -5121,7 +6050,7 @@
               <w:rPr>
                 <w:sz w:val="18"/>
               </w:rPr>
-              <w:t>IQR outlier utilities and diagnostic helpers</w:t>
+              <w:t>IQR outlier utilities (compute_iqr_outliers)</w:t>
             </w:r>
           </w:p>
         </w:tc>
@@ -5229,7 +6158,7 @@
               <w:rPr>
                 <w:sz w:val="18"/>
               </w:rPr>
-              <w:t>Raw dataset (1,210 rows × 19 cols)</w:t>
+              <w:t>Raw dataset (1210 rows × 19 cols)</w:t>
             </w:r>
           </w:p>
         </w:tc>
@@ -5265,7 +6194,7 @@
               <w:rPr>
                 <w:sz w:val="18"/>
               </w:rPr>
-              <w:t>Processed dataset (1,200 rows × 23 cols)</w:t>
+              <w:t>Processed dataset (1200 rows × 23 cols)</w:t>
             </w:r>
           </w:p>
         </w:tc>
@@ -5427,7 +6356,7 @@
           <w:color w:val="1C1C2E"/>
           <w:sz w:val="20"/>
         </w:rPr>
-        <w:t>The final processed dataset (1200 rows × 23 columns) is free of missing values, duplicate records, and uncapped outliers. All categorical variables are numerically encoded and the three continuous features are StandardScaler-normalised. Memory footprint was reduced from ~1.12 MB to ~0.21 MB (~81.1% reduction) through removal of object-dtype columns and primary keys.</w:t>
+        <w:t>The pipeline addressed 120 missing or invalid cells (93 explicit NaN, 25 blank TotalCharges strings, and 2 invalid negative values), removed 10 duplicate rows, and handled 5 anomalous numerical values (2 corrected to NaN and imputed; 3 IQR-capped). Memory footprint was reduced from ~1.12 MB to ~0.21 MB (~81.1% reduction) through dtype optimisation.</w:t>
       </w:r>
     </w:p>
     <w:p/>
@@ -5447,7 +6376,7 @@
           <w:color w:val="1C1C2E"/>
           <w:sz w:val="20"/>
         </w:rPr>
-        <w:t>The dataset, after completing this preprocessing pipeline, is suitable as a preprocessed input for downstream machine learning tasks including binary classification models such as Logistic Regression, Random Forest, and Gradient Boosting.</w:t>
+        <w:t>The final processed dataset (1200 rows × 23 columns, Churn: 439 churned / 761 non-churned) is suitable as a preprocessed input for downstream machine learning tasks including binary classification models such as Logistic Regression, Random Forest, and Gradient Boosting.</w:t>
       </w:r>
     </w:p>
     <w:p/>

</xml_diff>